<commit_message>
actualizacion de los resultados a porcentajes
</commit_message>
<xml_diff>
--- a/Informe/Informe Simulacion Politicas y Gestion de Memoria.docx
+++ b/Informe/Informe Simulacion Politicas y Gestion de Memoria.docx
@@ -939,8 +939,21 @@
                               <w:pStyle w:val="Ttulo3"/>
                               <w:jc w:val="center"/>
                             </w:pPr>
+                            <w:proofErr w:type="gramStart"/>
                             <w:r>
-                              <w:t xml:space="preserve">T  E  S  I  </w:t>
+                              <w:t>T  E</w:t>
+                            </w:r>
+                            <w:proofErr w:type="gramEnd"/>
+                            <w:r>
+                              <w:t xml:space="preserve">  </w:t>
+                            </w:r>
+                            <w:proofErr w:type="gramStart"/>
+                            <w:r>
+                              <w:t>S  I</w:t>
+                            </w:r>
+                            <w:proofErr w:type="gramEnd"/>
+                            <w:r>
+                              <w:t xml:space="preserve">  </w:t>
                             </w:r>
                             <w:r>
                               <w:t>S</w:t>
@@ -2162,8 +2175,21 @@
                         <w:pStyle w:val="Ttulo3"/>
                         <w:jc w:val="center"/>
                       </w:pPr>
+                      <w:proofErr w:type="gramStart"/>
                       <w:r>
-                        <w:t xml:space="preserve">T  E  S  I  </w:t>
+                        <w:t>T  E</w:t>
+                      </w:r>
+                      <w:proofErr w:type="gramEnd"/>
+                      <w:r>
+                        <w:t xml:space="preserve">  </w:t>
+                      </w:r>
+                      <w:proofErr w:type="gramStart"/>
+                      <w:r>
+                        <w:t>S  I</w:t>
+                      </w:r>
+                      <w:proofErr w:type="gramEnd"/>
+                      <w:r>
+                        <w:t xml:space="preserve">  </w:t>
                       </w:r>
                       <w:r>
                         <w:t>S</w:t>
@@ -2920,6 +2946,7 @@
     <w:p>
       <w:pPr>
         <w:pStyle w:val="Ttulo2"/>
+        <w:jc w:val="both"/>
         <w:rPr>
           <w:rFonts w:cs="Times New Roman"/>
         </w:rPr>
@@ -2935,6 +2962,105 @@
           <w:rFonts w:cs="Times New Roman"/>
         </w:rPr>
         <w:t>. Objetivo</w:t>
+      </w:r>
+    </w:p>
+    <w:p>
+      <w:pPr>
+        <w:pStyle w:val="Prrafodelista"/>
+        <w:numPr>
+          <w:ilvl w:val="0"/>
+          <w:numId w:val="11"/>
+        </w:numPr>
+        <w:jc w:val="both"/>
+        <w:rPr>
+          <w:rFonts w:ascii="Times New Roman" w:hAnsi="Times New Roman" w:cs="Times New Roman"/>
+        </w:rPr>
+      </w:pPr>
+      <w:r>
+        <w:rPr>
+          <w:rFonts w:ascii="Times New Roman" w:hAnsi="Times New Roman" w:cs="Times New Roman"/>
+        </w:rPr>
+        <w:t xml:space="preserve">Implementar los algoritmos de planificación de procesos (FCFS, SPN, SRT y Round Robin) y de gestión de memoria (First </w:t>
+      </w:r>
+      <w:proofErr w:type="spellStart"/>
+      <w:r>
+        <w:rPr>
+          <w:rFonts w:ascii="Times New Roman" w:hAnsi="Times New Roman" w:cs="Times New Roman"/>
+        </w:rPr>
+        <w:t>Fit</w:t>
+      </w:r>
+      <w:proofErr w:type="spellEnd"/>
+      <w:r>
+        <w:rPr>
+          <w:rFonts w:ascii="Times New Roman" w:hAnsi="Times New Roman" w:cs="Times New Roman"/>
+        </w:rPr>
+        <w:t xml:space="preserve">, Best </w:t>
+      </w:r>
+      <w:proofErr w:type="spellStart"/>
+      <w:r>
+        <w:rPr>
+          <w:rFonts w:ascii="Times New Roman" w:hAnsi="Times New Roman" w:cs="Times New Roman"/>
+        </w:rPr>
+        <w:t>Fit</w:t>
+      </w:r>
+      <w:proofErr w:type="spellEnd"/>
+      <w:r>
+        <w:rPr>
+          <w:rFonts w:ascii="Times New Roman" w:hAnsi="Times New Roman" w:cs="Times New Roman"/>
+        </w:rPr>
+        <w:t xml:space="preserve"> y Worst </w:t>
+      </w:r>
+      <w:proofErr w:type="spellStart"/>
+      <w:r>
+        <w:rPr>
+          <w:rFonts w:ascii="Times New Roman" w:hAnsi="Times New Roman" w:cs="Times New Roman"/>
+        </w:rPr>
+        <w:t>Fit</w:t>
+      </w:r>
+      <w:proofErr w:type="spellEnd"/>
+      <w:r>
+        <w:rPr>
+          <w:rFonts w:ascii="Times New Roman" w:hAnsi="Times New Roman" w:cs="Times New Roman"/>
+        </w:rPr>
+        <w:t xml:space="preserve">). </w:t>
+      </w:r>
+    </w:p>
+    <w:p>
+      <w:pPr>
+        <w:pStyle w:val="Prrafodelista"/>
+        <w:numPr>
+          <w:ilvl w:val="0"/>
+          <w:numId w:val="11"/>
+        </w:numPr>
+        <w:jc w:val="both"/>
+        <w:rPr>
+          <w:rFonts w:ascii="Times New Roman" w:hAnsi="Times New Roman" w:cs="Times New Roman"/>
+        </w:rPr>
+      </w:pPr>
+      <w:r>
+        <w:rPr>
+          <w:rFonts w:ascii="Times New Roman" w:hAnsi="Times New Roman" w:cs="Times New Roman"/>
+        </w:rPr>
+        <w:t xml:space="preserve">Permitir la carga de datos mediante archivos CSV para simular distintos escenarios de ejecución. </w:t>
+      </w:r>
+    </w:p>
+    <w:p>
+      <w:pPr>
+        <w:pStyle w:val="Prrafodelista"/>
+        <w:numPr>
+          <w:ilvl w:val="0"/>
+          <w:numId w:val="11"/>
+        </w:numPr>
+        <w:jc w:val="both"/>
+        <w:rPr>
+          <w:rFonts w:ascii="Times New Roman" w:hAnsi="Times New Roman" w:cs="Times New Roman"/>
+        </w:rPr>
+      </w:pPr>
+      <w:r>
+        <w:rPr>
+          <w:rFonts w:ascii="Times New Roman" w:hAnsi="Times New Roman" w:cs="Times New Roman"/>
+        </w:rPr>
+        <w:t>Visualizar los resultados mediante métricas, tablas y diagramas de Gantt.</w:t>
       </w:r>
     </w:p>
     <w:p>
@@ -3052,6 +3178,7 @@
         <w:rPr>
           <w:rFonts w:cs="Times New Roman"/>
         </w:rPr>
+        <w:lastRenderedPageBreak/>
         <w:t>4</w:t>
       </w:r>
       <w:r>
@@ -3153,7 +3280,239 @@
         <w:rPr>
           <w:rFonts w:ascii="Times New Roman" w:hAnsi="Times New Roman" w:cs="Times New Roman"/>
         </w:rPr>
-        <w:lastRenderedPageBreak/>
+        <w:t>En su funcionamiento:</w:t>
+      </w:r>
+    </w:p>
+    <w:p>
+      <w:pPr>
+        <w:pStyle w:val="Prrafodelista"/>
+        <w:numPr>
+          <w:ilvl w:val="0"/>
+          <w:numId w:val="1"/>
+        </w:numPr>
+        <w:rPr>
+          <w:rFonts w:ascii="Times New Roman" w:hAnsi="Times New Roman" w:cs="Times New Roman"/>
+        </w:rPr>
+      </w:pPr>
+      <w:r>
+        <w:rPr>
+          <w:rFonts w:ascii="Times New Roman" w:hAnsi="Times New Roman" w:cs="Times New Roman"/>
+        </w:rPr>
+        <w:t xml:space="preserve">Los procesos se ordenan según su tiempo de llegada. </w:t>
+      </w:r>
+    </w:p>
+    <w:p>
+      <w:pPr>
+        <w:pStyle w:val="Prrafodelista"/>
+        <w:numPr>
+          <w:ilvl w:val="0"/>
+          <w:numId w:val="1"/>
+        </w:numPr>
+        <w:rPr>
+          <w:rFonts w:ascii="Times New Roman" w:hAnsi="Times New Roman" w:cs="Times New Roman"/>
+        </w:rPr>
+      </w:pPr>
+      <w:r>
+        <w:rPr>
+          <w:rFonts w:ascii="Times New Roman" w:hAnsi="Times New Roman" w:cs="Times New Roman"/>
+        </w:rPr>
+        <w:t xml:space="preserve">Cada proceso se ejecuta completamente antes de pasar al siguiente. </w:t>
+      </w:r>
+    </w:p>
+    <w:p>
+      <w:pPr>
+        <w:pStyle w:val="Prrafodelista"/>
+        <w:numPr>
+          <w:ilvl w:val="0"/>
+          <w:numId w:val="1"/>
+        </w:numPr>
+        <w:rPr>
+          <w:rFonts w:ascii="Times New Roman" w:hAnsi="Times New Roman" w:cs="Times New Roman"/>
+        </w:rPr>
+      </w:pPr>
+      <w:r>
+        <w:rPr>
+          <w:rFonts w:ascii="Times New Roman" w:hAnsi="Times New Roman" w:cs="Times New Roman"/>
+        </w:rPr>
+        <w:t>No existe priorización ni reorganización</w:t>
+      </w:r>
+      <w:r>
+        <w:rPr>
+          <w:rFonts w:ascii="Times New Roman" w:hAnsi="Times New Roman" w:cs="Times New Roman"/>
+        </w:rPr>
+        <w:t xml:space="preserve"> durante la ejecución. </w:t>
+      </w:r>
+    </w:p>
+    <w:p>
+      <w:pPr>
+        <w:pStyle w:val="Ttulo3"/>
+        <w:rPr>
+          <w:rFonts w:cs="Times New Roman"/>
+        </w:rPr>
+      </w:pPr>
+      <w:r>
+        <w:rPr>
+          <w:rFonts w:cs="Times New Roman"/>
+        </w:rPr>
+        <w:t>SPN (Shortest Process Next)</w:t>
+      </w:r>
+    </w:p>
+    <w:p>
+      <w:pPr>
+        <w:rPr>
+          <w:rFonts w:ascii="Times New Roman" w:hAnsi="Times New Roman" w:cs="Times New Roman"/>
+        </w:rPr>
+      </w:pPr>
+      <w:r>
+        <w:rPr>
+          <w:rFonts w:ascii="Times New Roman" w:hAnsi="Times New Roman" w:cs="Times New Roman"/>
+        </w:rPr>
+        <w:t>El algoritmo SPN (Shortest Process Next) selecciona el proceso con menor tiempo de CPU entre los procesos que ya han llegado al sistema. Al igual que FCFS, es un algoritmo no expulsivo, por lo que el proceso seleccionado se ejecuta hasta su finalización sin interrupciones.</w:t>
+      </w:r>
+    </w:p>
+    <w:p>
+      <w:pPr>
+        <w:rPr>
+          <w:rFonts w:ascii="Times New Roman" w:hAnsi="Times New Roman" w:cs="Times New Roman"/>
+        </w:rPr>
+      </w:pPr>
+      <w:r>
+        <w:rPr>
+          <w:rFonts w:ascii="Times New Roman" w:hAnsi="Times New Roman" w:cs="Times New Roman"/>
+        </w:rPr>
+        <w:t>Este enfoque busca optimizar el tiempo de espera promedio, priorizando los procesos más cortos.</w:t>
+      </w:r>
+    </w:p>
+    <w:p>
+      <w:pPr>
+        <w:rPr>
+          <w:rFonts w:ascii="Times New Roman" w:hAnsi="Times New Roman" w:cs="Times New Roman"/>
+        </w:rPr>
+      </w:pPr>
+      <w:r>
+        <w:rPr>
+          <w:rFonts w:ascii="Times New Roman" w:hAnsi="Times New Roman" w:cs="Times New Roman"/>
+        </w:rPr>
+        <w:t>En su funcionamiento:</w:t>
+      </w:r>
+    </w:p>
+    <w:p>
+      <w:pPr>
+        <w:pStyle w:val="Prrafodelista"/>
+        <w:numPr>
+          <w:ilvl w:val="0"/>
+          <w:numId w:val="2"/>
+        </w:numPr>
+        <w:rPr>
+          <w:rFonts w:ascii="Times New Roman" w:hAnsi="Times New Roman" w:cs="Times New Roman"/>
+        </w:rPr>
+      </w:pPr>
+      <w:r>
+        <w:rPr>
+          <w:rFonts w:ascii="Times New Roman" w:hAnsi="Times New Roman" w:cs="Times New Roman"/>
+        </w:rPr>
+        <w:t xml:space="preserve">Solo compiten los procesos que ya han llegado en el instante de selección. </w:t>
+      </w:r>
+    </w:p>
+    <w:p>
+      <w:pPr>
+        <w:pStyle w:val="Prrafodelista"/>
+        <w:numPr>
+          <w:ilvl w:val="0"/>
+          <w:numId w:val="2"/>
+        </w:numPr>
+        <w:rPr>
+          <w:rFonts w:ascii="Times New Roman" w:hAnsi="Times New Roman" w:cs="Times New Roman"/>
+        </w:rPr>
+      </w:pPr>
+      <w:r>
+        <w:rPr>
+          <w:rFonts w:ascii="Times New Roman" w:hAnsi="Times New Roman" w:cs="Times New Roman"/>
+        </w:rPr>
+        <w:t xml:space="preserve">Se elige el proceso con menor tiempo de CPU disponible. </w:t>
+      </w:r>
+    </w:p>
+    <w:p>
+      <w:pPr>
+        <w:pStyle w:val="Prrafodelista"/>
+        <w:numPr>
+          <w:ilvl w:val="0"/>
+          <w:numId w:val="2"/>
+        </w:numPr>
+        <w:rPr>
+          <w:rFonts w:ascii="Times New Roman" w:hAnsi="Times New Roman" w:cs="Times New Roman"/>
+        </w:rPr>
+      </w:pPr>
+      <w:r>
+        <w:rPr>
+          <w:rFonts w:ascii="Times New Roman" w:hAnsi="Times New Roman" w:cs="Times New Roman"/>
+        </w:rPr>
+        <w:t xml:space="preserve">El orden de ejecución puede variar respecto al orden de llegada. </w:t>
+      </w:r>
+    </w:p>
+    <w:p>
+      <w:pPr>
+        <w:rPr>
+          <w:rFonts w:ascii="Times New Roman" w:hAnsi="Times New Roman" w:cs="Times New Roman"/>
+        </w:rPr>
+      </w:pPr>
+      <w:r>
+        <w:rPr>
+          <w:rFonts w:ascii="Times New Roman" w:hAnsi="Times New Roman" w:cs="Times New Roman"/>
+        </w:rPr>
+        <w:t>Un punto importante a considerar es que un proceso con menor tiempo de CPU no puede ser seleccionado si aún no ha llegado al sistema, lo que puede influir en el orden final de ejecución.</w:t>
+      </w:r>
+    </w:p>
+    <w:p>
+      <w:pPr>
+        <w:pStyle w:val="Ttulo3"/>
+        <w:rPr>
+          <w:rFonts w:cs="Times New Roman"/>
+        </w:rPr>
+      </w:pPr>
+      <w:r>
+        <w:rPr>
+          <w:rFonts w:cs="Times New Roman"/>
+        </w:rPr>
+        <w:t>SRT (Shortest Remaining Time)</w:t>
+      </w:r>
+    </w:p>
+    <w:p>
+      <w:pPr>
+        <w:rPr>
+          <w:rFonts w:ascii="Times New Roman" w:hAnsi="Times New Roman" w:cs="Times New Roman"/>
+        </w:rPr>
+      </w:pPr>
+      <w:r>
+        <w:rPr>
+          <w:rFonts w:ascii="Times New Roman" w:hAnsi="Times New Roman" w:cs="Times New Roman"/>
+        </w:rPr>
+        <w:t>El algoritmo SRT (Shortest Remaining Time) es la versión expulsiva de SPN. En este caso, el sistema siempre selecciona el proceso con menor tiempo restante de ejecución, incluso si eso implica interrumpir un proceso que ya se está ejecutando.</w:t>
+      </w:r>
+    </w:p>
+    <w:p>
+      <w:pPr>
+        <w:rPr>
+          <w:rFonts w:ascii="Times New Roman" w:hAnsi="Times New Roman" w:cs="Times New Roman"/>
+        </w:rPr>
+      </w:pPr>
+      <w:r>
+        <w:rPr>
+          <w:rFonts w:ascii="Times New Roman" w:hAnsi="Times New Roman" w:cs="Times New Roman"/>
+        </w:rPr>
+        <w:t>Este algoritmo mejora el tiempo de respuesta en sistemas interactivos, pero aumenta la complejidad de implementación.</w:t>
+      </w:r>
+    </w:p>
+    <w:p>
+      <w:pPr>
+        <w:rPr>
+          <w:rFonts w:ascii="Times New Roman" w:hAnsi="Times New Roman" w:cs="Times New Roman"/>
+        </w:rPr>
+      </w:pPr>
+      <w:r>
+        <w:rPr>
+          <w:rFonts w:ascii="Times New Roman" w:hAnsi="Times New Roman" w:cs="Times New Roman"/>
+        </w:rPr>
         <w:t>En su funcionamiento:</w:t>
       </w:r>
     </w:p>
@@ -3172,7 +3531,7 @@
         <w:rPr>
           <w:rFonts w:ascii="Times New Roman" w:hAnsi="Times New Roman" w:cs="Times New Roman"/>
         </w:rPr>
-        <w:t xml:space="preserve">Los procesos se ordenan según su tiempo de llegada. </w:t>
+        <w:t xml:space="preserve">Es un algoritmo expulsivo (preemptive). </w:t>
       </w:r>
     </w:p>
     <w:p>
@@ -3190,7 +3549,7 @@
         <w:rPr>
           <w:rFonts w:ascii="Times New Roman" w:hAnsi="Times New Roman" w:cs="Times New Roman"/>
         </w:rPr>
-        <w:t xml:space="preserve">Cada proceso se ejecuta completamente antes de pasar al siguiente. </w:t>
+        <w:t xml:space="preserve">El proceso en ejecución puede ser interrumpido si llega uno con menor tiempo restante. </w:t>
       </w:r>
     </w:p>
     <w:p>
@@ -3208,13 +3567,7 @@
         <w:rPr>
           <w:rFonts w:ascii="Times New Roman" w:hAnsi="Times New Roman" w:cs="Times New Roman"/>
         </w:rPr>
-        <w:t>No existe priorización ni reorganización</w:t>
-      </w:r>
-      <w:r>
-        <w:rPr>
-          <w:rFonts w:ascii="Times New Roman" w:hAnsi="Times New Roman" w:cs="Times New Roman"/>
-        </w:rPr>
-        <w:t xml:space="preserve"> durante la ejecución. </w:t>
+        <w:t xml:space="preserve">Busca minimizar el tiempo de espera promedio. </w:t>
       </w:r>
     </w:p>
     <w:p>
@@ -3228,33 +3581,33 @@
         <w:rPr>
           <w:rFonts w:cs="Times New Roman"/>
         </w:rPr>
-        <w:t>SPN (Shortest Process Next)</w:t>
-      </w:r>
-    </w:p>
-    <w:p>
-      <w:pPr>
-        <w:rPr>
-          <w:rFonts w:ascii="Times New Roman" w:hAnsi="Times New Roman" w:cs="Times New Roman"/>
-        </w:rPr>
-      </w:pPr>
-      <w:r>
-        <w:rPr>
-          <w:rFonts w:ascii="Times New Roman" w:hAnsi="Times New Roman" w:cs="Times New Roman"/>
-        </w:rPr>
-        <w:t>El algoritmo SPN (Shortest Process Next) selecciona el proceso con menor tiempo de CPU entre los procesos que ya han llegado al sistema. Al igual que FCFS, es un algoritmo no expulsivo, por lo que el proceso seleccionado se ejecuta hasta su finalización sin interrupciones.</w:t>
-      </w:r>
-    </w:p>
-    <w:p>
-      <w:pPr>
-        <w:rPr>
-          <w:rFonts w:ascii="Times New Roman" w:hAnsi="Times New Roman" w:cs="Times New Roman"/>
-        </w:rPr>
-      </w:pPr>
-      <w:r>
-        <w:rPr>
-          <w:rFonts w:ascii="Times New Roman" w:hAnsi="Times New Roman" w:cs="Times New Roman"/>
-        </w:rPr>
-        <w:t>Este enfoque busca optimizar el tiempo de espera promedio, priorizando los procesos más cortos.</w:t>
+        <w:t>RR (Round Robin)</w:t>
+      </w:r>
+    </w:p>
+    <w:p>
+      <w:pPr>
+        <w:rPr>
+          <w:rFonts w:ascii="Times New Roman" w:hAnsi="Times New Roman" w:cs="Times New Roman"/>
+        </w:rPr>
+      </w:pPr>
+      <w:r>
+        <w:rPr>
+          <w:rFonts w:ascii="Times New Roman" w:hAnsi="Times New Roman" w:cs="Times New Roman"/>
+        </w:rPr>
+        <w:t>El algoritmo Round Robin asigna a cada proceso un intervalo de tiempo fijo llamado quantum. Los procesos se organizan en una cola circular y se ejecutan de forma rotativa.</w:t>
+      </w:r>
+    </w:p>
+    <w:p>
+      <w:pPr>
+        <w:rPr>
+          <w:rFonts w:ascii="Times New Roman" w:hAnsi="Times New Roman" w:cs="Times New Roman"/>
+        </w:rPr>
+      </w:pPr>
+      <w:r>
+        <w:rPr>
+          <w:rFonts w:ascii="Times New Roman" w:hAnsi="Times New Roman" w:cs="Times New Roman"/>
+        </w:rPr>
+        <w:t>Si un proceso no termina dentro de su quantum, es interrumpido y colocado al final de la cola.</w:t>
       </w:r>
     </w:p>
     <w:p>
@@ -3285,7 +3638,7 @@
         <w:rPr>
           <w:rFonts w:ascii="Times New Roman" w:hAnsi="Times New Roman" w:cs="Times New Roman"/>
         </w:rPr>
-        <w:t xml:space="preserve">Solo compiten los procesos que ya han llegado en el instante de selección. </w:t>
+        <w:t xml:space="preserve">Todos los procesos reciben un quantum de CPU. </w:t>
       </w:r>
     </w:p>
     <w:p>
@@ -3303,7 +3656,8 @@
         <w:rPr>
           <w:rFonts w:ascii="Times New Roman" w:hAnsi="Times New Roman" w:cs="Times New Roman"/>
         </w:rPr>
-        <w:t xml:space="preserve">Se elige el proceso con menor tiempo de CPU disponible. </w:t>
+        <w:lastRenderedPageBreak/>
+        <w:t xml:space="preserve">Es un algoritmo expulsivo. </w:t>
       </w:r>
     </w:p>
     <w:p>
@@ -3321,60 +3675,86 @@
         <w:rPr>
           <w:rFonts w:ascii="Times New Roman" w:hAnsi="Times New Roman" w:cs="Times New Roman"/>
         </w:rPr>
-        <w:t xml:space="preserve">El orden de ejecución puede variar respecto al orden de llegada. </w:t>
-      </w:r>
-    </w:p>
-    <w:p>
-      <w:pPr>
-        <w:rPr>
-          <w:rFonts w:ascii="Times New Roman" w:hAnsi="Times New Roman" w:cs="Times New Roman"/>
-        </w:rPr>
-      </w:pPr>
-      <w:r>
-        <w:rPr>
-          <w:rFonts w:ascii="Times New Roman" w:hAnsi="Times New Roman" w:cs="Times New Roman"/>
-        </w:rPr>
-        <w:t>Un punto importante a considerar es que un proceso con menor tiempo de CPU no puede ser seleccionado si aún no ha llegado al sistema, lo que puede influir en el orden final de ejecución.</w:t>
+        <w:t xml:space="preserve">Garantiza equidad entre procesos. </w:t>
+      </w:r>
+    </w:p>
+    <w:p>
+      <w:pPr>
+        <w:pStyle w:val="Prrafodelista"/>
+        <w:numPr>
+          <w:ilvl w:val="0"/>
+          <w:numId w:val="4"/>
+        </w:numPr>
+      </w:pPr>
+      <w:r>
+        <w:rPr>
+          <w:rFonts w:ascii="Times New Roman" w:hAnsi="Times New Roman" w:cs="Times New Roman"/>
+        </w:rPr>
+        <w:t>Es ideal para sistemas</w:t>
+      </w:r>
+      <w:r>
+        <w:t xml:space="preserve"> de tiempo compartido. </w:t>
+      </w:r>
+    </w:p>
+    <w:p>
+      <w:pPr>
+        <w:pStyle w:val="Ttulo2"/>
+      </w:pPr>
+      <w:r>
+        <w:t>Gestión de memoria</w:t>
       </w:r>
     </w:p>
     <w:p>
       <w:pPr>
         <w:pStyle w:val="Ttulo3"/>
-        <w:rPr>
-          <w:rFonts w:cs="Times New Roman"/>
-        </w:rPr>
-      </w:pPr>
-      <w:r>
-        <w:rPr>
-          <w:rFonts w:cs="Times New Roman"/>
-        </w:rPr>
-        <w:t>SRT (Shortest Remaining Time)</w:t>
-      </w:r>
-    </w:p>
-    <w:p>
-      <w:pPr>
-        <w:rPr>
-          <w:rFonts w:ascii="Times New Roman" w:hAnsi="Times New Roman" w:cs="Times New Roman"/>
-        </w:rPr>
-      </w:pPr>
-      <w:r>
-        <w:rPr>
-          <w:rFonts w:ascii="Times New Roman" w:hAnsi="Times New Roman" w:cs="Times New Roman"/>
-        </w:rPr>
-        <w:t>El algoritmo SRT (Shortest Remaining Time) es la versión expulsiva de SPN. En este caso, el sistema siempre selecciona el proceso con menor tiempo restante de ejecución, incluso si eso implica interrumpir un proceso que ya se está ejecutando.</w:t>
-      </w:r>
-    </w:p>
-    <w:p>
-      <w:pPr>
-        <w:rPr>
-          <w:rFonts w:ascii="Times New Roman" w:hAnsi="Times New Roman" w:cs="Times New Roman"/>
-        </w:rPr>
-      </w:pPr>
-      <w:r>
-        <w:rPr>
-          <w:rFonts w:ascii="Times New Roman" w:hAnsi="Times New Roman" w:cs="Times New Roman"/>
-        </w:rPr>
-        <w:t>Este algoritmo mejora el tiempo de respuesta en sistemas interactivos, pero aumenta la complejidad de implementación.</w:t>
+      </w:pPr>
+      <w:r>
+        <w:t xml:space="preserve">First </w:t>
+      </w:r>
+      <w:proofErr w:type="spellStart"/>
+      <w:r>
+        <w:t>Fit</w:t>
+      </w:r>
+      <w:proofErr w:type="spellEnd"/>
+    </w:p>
+    <w:p>
+      <w:pPr>
+        <w:rPr>
+          <w:rFonts w:ascii="Times New Roman" w:hAnsi="Times New Roman" w:cs="Times New Roman"/>
+        </w:rPr>
+      </w:pPr>
+      <w:r>
+        <w:rPr>
+          <w:rFonts w:ascii="Times New Roman" w:hAnsi="Times New Roman" w:cs="Times New Roman"/>
+        </w:rPr>
+        <w:t xml:space="preserve">El algoritmo First </w:t>
+      </w:r>
+      <w:proofErr w:type="spellStart"/>
+      <w:r>
+        <w:rPr>
+          <w:rFonts w:ascii="Times New Roman" w:hAnsi="Times New Roman" w:cs="Times New Roman"/>
+        </w:rPr>
+        <w:t>Fit</w:t>
+      </w:r>
+      <w:proofErr w:type="spellEnd"/>
+      <w:r>
+        <w:rPr>
+          <w:rFonts w:ascii="Times New Roman" w:hAnsi="Times New Roman" w:cs="Times New Roman"/>
+        </w:rPr>
+        <w:t xml:space="preserve"> consiste en asignar a cada proceso el primer bloque de memoria disponible que sea lo suficientemente grande para poder alojarlo. Es decir, se recorre la lista de bloques de memoria y se utiliza el primero que cumpla con el tamaño requerido.</w:t>
+      </w:r>
+    </w:p>
+    <w:p>
+      <w:pPr>
+        <w:rPr>
+          <w:rFonts w:ascii="Times New Roman" w:hAnsi="Times New Roman" w:cs="Times New Roman"/>
+        </w:rPr>
+      </w:pPr>
+      <w:r>
+        <w:rPr>
+          <w:rFonts w:ascii="Times New Roman" w:hAnsi="Times New Roman" w:cs="Times New Roman"/>
+        </w:rPr>
+        <w:t>Este método es bastante simple y rápido de implementar, ya que no necesita recorrer toda la memoria para encontrar la mejor opción, solo se detiene cuando encuentra un espacio adecuado. Sin embargo, con el tiempo puede generar fragmentación externa, debido a que quedan muchos espacios pequeños libres que ya no son útiles para procesos grandes.</w:t>
       </w:r>
     </w:p>
     <w:p>
@@ -3405,7 +3785,7 @@
         <w:rPr>
           <w:rFonts w:ascii="Times New Roman" w:hAnsi="Times New Roman" w:cs="Times New Roman"/>
         </w:rPr>
-        <w:t xml:space="preserve">Es un algoritmo expulsivo (preemptive). </w:t>
+        <w:t xml:space="preserve">Se recorre la memoria desde el inicio. </w:t>
       </w:r>
     </w:p>
     <w:p>
@@ -3423,7 +3803,7 @@
         <w:rPr>
           <w:rFonts w:ascii="Times New Roman" w:hAnsi="Times New Roman" w:cs="Times New Roman"/>
         </w:rPr>
-        <w:t xml:space="preserve">El proceso en ejecución puede ser interrumpido si llega uno con menor tiempo restante. </w:t>
+        <w:t xml:space="preserve">Se asigna el primer bloque que tenga el tamaño suficiente. </w:t>
       </w:r>
     </w:p>
     <w:p>
@@ -3441,47 +3821,74 @@
         <w:rPr>
           <w:rFonts w:ascii="Times New Roman" w:hAnsi="Times New Roman" w:cs="Times New Roman"/>
         </w:rPr>
-        <w:t xml:space="preserve">Busca minimizar el tiempo de espera promedio. </w:t>
+        <w:t xml:space="preserve">No busca optimizar el espacio, solo asigna rápidamente. </w:t>
       </w:r>
     </w:p>
     <w:p>
       <w:pPr>
         <w:pStyle w:val="Ttulo3"/>
-        <w:rPr>
-          <w:rFonts w:cs="Times New Roman"/>
-        </w:rPr>
-      </w:pPr>
-      <w:r>
-        <w:rPr>
-          <w:rFonts w:cs="Times New Roman"/>
-        </w:rPr>
-        <w:t>RR (Round Robin)</w:t>
-      </w:r>
-    </w:p>
-    <w:p>
-      <w:pPr>
-        <w:rPr>
-          <w:rFonts w:ascii="Times New Roman" w:hAnsi="Times New Roman" w:cs="Times New Roman"/>
-        </w:rPr>
-      </w:pPr>
-      <w:r>
-        <w:rPr>
-          <w:rFonts w:ascii="Times New Roman" w:hAnsi="Times New Roman" w:cs="Times New Roman"/>
-        </w:rPr>
-        <w:t>El algoritmo Round Robin asigna a cada proceso un intervalo de tiempo fijo llamado quantum. Los procesos se organizan en una cola circular y se ejecutan de forma rotativa.</w:t>
-      </w:r>
-    </w:p>
-    <w:p>
-      <w:pPr>
-        <w:rPr>
-          <w:rFonts w:ascii="Times New Roman" w:hAnsi="Times New Roman" w:cs="Times New Roman"/>
-        </w:rPr>
-      </w:pPr>
-      <w:r>
-        <w:rPr>
-          <w:rFonts w:ascii="Times New Roman" w:hAnsi="Times New Roman" w:cs="Times New Roman"/>
-        </w:rPr>
-        <w:t>Si un proceso no termina dentro de su quantum, es interrumpido y colocado al final de la cola.</w:t>
+      </w:pPr>
+      <w:r>
+        <w:t xml:space="preserve">Best </w:t>
+      </w:r>
+      <w:proofErr w:type="spellStart"/>
+      <w:r>
+        <w:t>Fit</w:t>
+      </w:r>
+      <w:proofErr w:type="spellEnd"/>
+    </w:p>
+    <w:p>
+      <w:pPr>
+        <w:rPr>
+          <w:rFonts w:ascii="Times New Roman" w:hAnsi="Times New Roman" w:cs="Times New Roman"/>
+        </w:rPr>
+      </w:pPr>
+      <w:r>
+        <w:rPr>
+          <w:rFonts w:ascii="Times New Roman" w:hAnsi="Times New Roman" w:cs="Times New Roman"/>
+        </w:rPr>
+        <w:t xml:space="preserve">El algoritmo Best </w:t>
+      </w:r>
+      <w:proofErr w:type="spellStart"/>
+      <w:r>
+        <w:rPr>
+          <w:rFonts w:ascii="Times New Roman" w:hAnsi="Times New Roman" w:cs="Times New Roman"/>
+        </w:rPr>
+        <w:t>Fit</w:t>
+      </w:r>
+      <w:proofErr w:type="spellEnd"/>
+      <w:r>
+        <w:rPr>
+          <w:rFonts w:ascii="Times New Roman" w:hAnsi="Times New Roman" w:cs="Times New Roman"/>
+        </w:rPr>
+        <w:t xml:space="preserve"> busca asignar cada proceso al bloque de memoria más pequeño posible que aún sea capaz de alojarlo. A diferencia de First </w:t>
+      </w:r>
+      <w:proofErr w:type="spellStart"/>
+      <w:r>
+        <w:rPr>
+          <w:rFonts w:ascii="Times New Roman" w:hAnsi="Times New Roman" w:cs="Times New Roman"/>
+        </w:rPr>
+        <w:t>Fit</w:t>
+      </w:r>
+      <w:proofErr w:type="spellEnd"/>
+      <w:r>
+        <w:rPr>
+          <w:rFonts w:ascii="Times New Roman" w:hAnsi="Times New Roman" w:cs="Times New Roman"/>
+        </w:rPr>
+        <w:t>, este algoritmo revisa todos los bloques disponibles antes de tomar una decisión.</w:t>
+      </w:r>
+    </w:p>
+    <w:p>
+      <w:pPr>
+        <w:rPr>
+          <w:rFonts w:ascii="Times New Roman" w:hAnsi="Times New Roman" w:cs="Times New Roman"/>
+        </w:rPr>
+      </w:pPr>
+      <w:r>
+        <w:rPr>
+          <w:rFonts w:ascii="Times New Roman" w:hAnsi="Times New Roman" w:cs="Times New Roman"/>
+        </w:rPr>
+        <w:t>La idea principal es aprovechar mejor la memoria y reducir el desperdicio de espacio. Sin embargo, este método puede ser más lento, ya que necesita recorrer toda la lista de bloques libres, y también puede generar muchos fragmentos pequeños de memoria que luego no se pueden utilizar.</w:t>
       </w:r>
     </w:p>
     <w:p>
@@ -3512,7 +3919,7 @@
         <w:rPr>
           <w:rFonts w:ascii="Times New Roman" w:hAnsi="Times New Roman" w:cs="Times New Roman"/>
         </w:rPr>
-        <w:t xml:space="preserve">Todos los procesos reciben un quantum de CPU. </w:t>
+        <w:t xml:space="preserve">Se revisan todos los bloques disponibles. </w:t>
       </w:r>
     </w:p>
     <w:p>
@@ -3530,7 +3937,7 @@
         <w:rPr>
           <w:rFonts w:ascii="Times New Roman" w:hAnsi="Times New Roman" w:cs="Times New Roman"/>
         </w:rPr>
-        <w:t xml:space="preserve">Es un algoritmo expulsivo. </w:t>
+        <w:t xml:space="preserve">Se elige el bloque más pequeño que pueda contener el proceso. </w:t>
       </w:r>
     </w:p>
     <w:p>
@@ -3548,33 +3955,7 @@
         <w:rPr>
           <w:rFonts w:ascii="Times New Roman" w:hAnsi="Times New Roman" w:cs="Times New Roman"/>
         </w:rPr>
-        <w:t xml:space="preserve">Garantiza equidad entre procesos. </w:t>
-      </w:r>
-    </w:p>
-    <w:p>
-      <w:pPr>
-        <w:pStyle w:val="Prrafodelista"/>
-        <w:numPr>
-          <w:ilvl w:val="0"/>
-          <w:numId w:val="6"/>
-        </w:numPr>
-      </w:pPr>
-      <w:r>
-        <w:rPr>
-          <w:rFonts w:ascii="Times New Roman" w:hAnsi="Times New Roman" w:cs="Times New Roman"/>
-        </w:rPr>
-        <w:t>Es ideal para sistemas</w:t>
-      </w:r>
-      <w:r>
-        <w:t xml:space="preserve"> de tiempo compartido. </w:t>
-      </w:r>
-    </w:p>
-    <w:p>
-      <w:pPr>
-        <w:pStyle w:val="Ttulo2"/>
-      </w:pPr>
-      <w:r>
-        <w:t>Gestión de memoria</w:t>
+        <w:t xml:space="preserve">Busca optimizar el uso de memoria. </w:t>
       </w:r>
     </w:p>
     <w:p>
@@ -3582,7 +3963,7 @@
         <w:pStyle w:val="Ttulo3"/>
       </w:pPr>
       <w:r>
-        <w:t xml:space="preserve">First </w:t>
+        <w:t xml:space="preserve">Worst </w:t>
       </w:r>
       <w:proofErr w:type="spellStart"/>
       <w:r>
@@ -3600,7 +3981,7 @@
         <w:rPr>
           <w:rFonts w:ascii="Times New Roman" w:hAnsi="Times New Roman" w:cs="Times New Roman"/>
         </w:rPr>
-        <w:t xml:space="preserve">El algoritmo First </w:t>
+        <w:t xml:space="preserve">El algoritmo Worst </w:t>
       </w:r>
       <w:proofErr w:type="spellStart"/>
       <w:r>
@@ -3614,27 +3995,34 @@
         <w:rPr>
           <w:rFonts w:ascii="Times New Roman" w:hAnsi="Times New Roman" w:cs="Times New Roman"/>
         </w:rPr>
-        <w:t xml:space="preserve"> consiste en asignar a cada proceso el primer bloque de memoria disponible que sea lo suficientemente grande para poder alojarlo. Es decir, se recorre la lista de bloques de memoria y se utiliza el primero que cumpla con el tamaño requerido.</w:t>
-      </w:r>
-    </w:p>
-    <w:p>
-      <w:pPr>
-        <w:rPr>
-          <w:rFonts w:ascii="Times New Roman" w:hAnsi="Times New Roman" w:cs="Times New Roman"/>
-        </w:rPr>
-      </w:pPr>
-      <w:r>
-        <w:rPr>
-          <w:rFonts w:ascii="Times New Roman" w:hAnsi="Times New Roman" w:cs="Times New Roman"/>
-        </w:rPr>
-        <w:t xml:space="preserve">Este método es bastante simple y rápido de implementar, ya que no necesita recorrer toda la memoria para encontrar la mejor opción, solo se detiene cuando encuentra un espacio adecuado. Sin embargo, </w:t>
-      </w:r>
-      <w:r>
-        <w:rPr>
-          <w:rFonts w:ascii="Times New Roman" w:hAnsi="Times New Roman" w:cs="Times New Roman"/>
-        </w:rPr>
-        <w:lastRenderedPageBreak/>
-        <w:t>con el tiempo puede generar fragmentación externa, debido a que quedan muchos espacios pequeños libres que ya no son útiles para procesos grandes.</w:t>
+        <w:t xml:space="preserve"> hace lo contrario al Best </w:t>
+      </w:r>
+      <w:proofErr w:type="spellStart"/>
+      <w:r>
+        <w:rPr>
+          <w:rFonts w:ascii="Times New Roman" w:hAnsi="Times New Roman" w:cs="Times New Roman"/>
+        </w:rPr>
+        <w:t>Fit</w:t>
+      </w:r>
+      <w:proofErr w:type="spellEnd"/>
+      <w:r>
+        <w:rPr>
+          <w:rFonts w:ascii="Times New Roman" w:hAnsi="Times New Roman" w:cs="Times New Roman"/>
+        </w:rPr>
+        <w:t>, ya que selecciona el bloque de memoria más grande disponible para asignar un proceso. La idea es dejar espacios grandes libres después de la asignación, con la esperanza de que puedan ser útiles para procesos futuros.</w:t>
+      </w:r>
+    </w:p>
+    <w:p>
+      <w:pPr>
+        <w:rPr>
+          <w:rFonts w:ascii="Times New Roman" w:hAnsi="Times New Roman" w:cs="Times New Roman"/>
+        </w:rPr>
+      </w:pPr>
+      <w:r>
+        <w:rPr>
+          <w:rFonts w:ascii="Times New Roman" w:hAnsi="Times New Roman" w:cs="Times New Roman"/>
+        </w:rPr>
+        <w:t>Este enfoque puede parecer útil al inicio, pero en la práctica puede desperdiciar memoria, ya que los grandes bloques se van fragmentando de forma poco eficiente. Además, no siempre garantiza un buen aprovechamiento del espacio.</w:t>
       </w:r>
     </w:p>
     <w:p>
@@ -3665,7 +4053,7 @@
         <w:rPr>
           <w:rFonts w:ascii="Times New Roman" w:hAnsi="Times New Roman" w:cs="Times New Roman"/>
         </w:rPr>
-        <w:t xml:space="preserve">Se recorre la memoria desde el inicio. </w:t>
+        <w:t xml:space="preserve">Se busca el bloque más grande disponible. </w:t>
       </w:r>
     </w:p>
     <w:p>
@@ -3683,7 +4071,7 @@
         <w:rPr>
           <w:rFonts w:ascii="Times New Roman" w:hAnsi="Times New Roman" w:cs="Times New Roman"/>
         </w:rPr>
-        <w:t xml:space="preserve">Se asigna el primer bloque que tenga el tamaño suficiente. </w:t>
+        <w:t xml:space="preserve">Se asigna el proceso a ese bloque. </w:t>
       </w:r>
     </w:p>
     <w:p>
@@ -3701,87 +4089,25 @@
         <w:rPr>
           <w:rFonts w:ascii="Times New Roman" w:hAnsi="Times New Roman" w:cs="Times New Roman"/>
         </w:rPr>
-        <w:t xml:space="preserve">No busca optimizar el espacio, solo asigna rápidamente. </w:t>
-      </w:r>
-    </w:p>
-    <w:p>
-      <w:pPr>
-        <w:pStyle w:val="Ttulo3"/>
-      </w:pPr>
-      <w:r>
-        <w:t xml:space="preserve">Best </w:t>
-      </w:r>
-      <w:proofErr w:type="spellStart"/>
-      <w:r>
-        <w:t>Fit</w:t>
-      </w:r>
-      <w:proofErr w:type="spellEnd"/>
-    </w:p>
-    <w:p>
-      <w:pPr>
-        <w:rPr>
-          <w:rFonts w:ascii="Times New Roman" w:hAnsi="Times New Roman" w:cs="Times New Roman"/>
-        </w:rPr>
-      </w:pPr>
-      <w:r>
-        <w:rPr>
-          <w:rFonts w:ascii="Times New Roman" w:hAnsi="Times New Roman" w:cs="Times New Roman"/>
-        </w:rPr>
-        <w:t xml:space="preserve">El algoritmo Best </w:t>
-      </w:r>
-      <w:proofErr w:type="spellStart"/>
-      <w:r>
-        <w:rPr>
-          <w:rFonts w:ascii="Times New Roman" w:hAnsi="Times New Roman" w:cs="Times New Roman"/>
-        </w:rPr>
-        <w:t>Fit</w:t>
-      </w:r>
-      <w:proofErr w:type="spellEnd"/>
-      <w:r>
-        <w:rPr>
-          <w:rFonts w:ascii="Times New Roman" w:hAnsi="Times New Roman" w:cs="Times New Roman"/>
-        </w:rPr>
-        <w:t xml:space="preserve"> busca asignar cada proceso al bloque de memoria más pequeño posible que aún sea capaz de alojarlo. A diferencia de First </w:t>
-      </w:r>
-      <w:proofErr w:type="spellStart"/>
-      <w:r>
-        <w:rPr>
-          <w:rFonts w:ascii="Times New Roman" w:hAnsi="Times New Roman" w:cs="Times New Roman"/>
-        </w:rPr>
-        <w:t>Fit</w:t>
-      </w:r>
-      <w:proofErr w:type="spellEnd"/>
-      <w:r>
-        <w:rPr>
-          <w:rFonts w:ascii="Times New Roman" w:hAnsi="Times New Roman" w:cs="Times New Roman"/>
-        </w:rPr>
-        <w:t>, este algoritmo revisa todos los bloques disponibles antes de tomar una decisión.</w:t>
-      </w:r>
-    </w:p>
-    <w:p>
-      <w:pPr>
-        <w:rPr>
-          <w:rFonts w:ascii="Times New Roman" w:hAnsi="Times New Roman" w:cs="Times New Roman"/>
-        </w:rPr>
-      </w:pPr>
-      <w:r>
-        <w:rPr>
-          <w:rFonts w:ascii="Times New Roman" w:hAnsi="Times New Roman" w:cs="Times New Roman"/>
-        </w:rPr>
-        <w:t>La idea principal es aprovechar mejor la memoria y reducir el desperdicio de espacio. Sin embargo, este método puede ser más lento, ya que necesita recorrer toda la lista de bloques libres, y también puede generar muchos fragmentos pequeños de memoria que luego no se pueden utilizar.</w:t>
-      </w:r>
-    </w:p>
-    <w:p>
-      <w:pPr>
-        <w:rPr>
-          <w:rFonts w:ascii="Times New Roman" w:hAnsi="Times New Roman" w:cs="Times New Roman"/>
-        </w:rPr>
-      </w:pPr>
-      <w:r>
-        <w:rPr>
-          <w:rFonts w:ascii="Times New Roman" w:hAnsi="Times New Roman" w:cs="Times New Roman"/>
-        </w:rPr>
-        <w:t>En su funcionamiento:</w:t>
+        <w:t>Intenta evitar fragmentos pequeños, aunque no siempre lo logra.</w:t>
+      </w:r>
+    </w:p>
+    <w:p>
+      <w:pPr>
+        <w:pStyle w:val="Ttulo2"/>
+      </w:pPr>
+      <w:r>
+        <w:rPr>
+          <w:rFonts w:asciiTheme="minorHAnsi" w:eastAsiaTheme="minorHAnsi" w:hAnsiTheme="minorHAnsi" w:cstheme="minorBidi"/>
+          <w:bCs/>
+          <w:color w:val="auto"/>
+          <w:sz w:val="22"/>
+          <w:szCs w:val="22"/>
+        </w:rPr>
+        <w:t>.</w:t>
+      </w:r>
+      <w:r>
+        <w:t>4. Implementación del sistema</w:t>
       </w:r>
     </w:p>
     <w:p>
@@ -3791,15 +4117,51 @@
           <w:ilvl w:val="0"/>
           <w:numId w:val="8"/>
         </w:numPr>
-        <w:rPr>
-          <w:rFonts w:ascii="Times New Roman" w:hAnsi="Times New Roman" w:cs="Times New Roman"/>
-        </w:rPr>
-      </w:pPr>
-      <w:r>
-        <w:rPr>
-          <w:rFonts w:ascii="Times New Roman" w:hAnsi="Times New Roman" w:cs="Times New Roman"/>
-        </w:rPr>
-        <w:t xml:space="preserve">Se revisan todos los bloques disponibles. </w:t>
+        <w:jc w:val="both"/>
+        <w:rPr>
+          <w:rFonts w:ascii="Times New Roman" w:hAnsi="Times New Roman" w:cs="Times New Roman"/>
+        </w:rPr>
+      </w:pPr>
+      <w:r>
+        <w:rPr>
+          <w:rFonts w:ascii="Times New Roman" w:hAnsi="Times New Roman" w:cs="Times New Roman"/>
+        </w:rPr>
+        <w:t xml:space="preserve">Para la implementación del sistema, en primer </w:t>
+      </w:r>
+      <w:proofErr w:type="gramStart"/>
+      <w:r>
+        <w:rPr>
+          <w:rFonts w:ascii="Times New Roman" w:hAnsi="Times New Roman" w:cs="Times New Roman"/>
+        </w:rPr>
+        <w:t>lugar</w:t>
+      </w:r>
+      <w:proofErr w:type="gramEnd"/>
+      <w:r>
+        <w:rPr>
+          <w:rFonts w:ascii="Times New Roman" w:hAnsi="Times New Roman" w:cs="Times New Roman"/>
+        </w:rPr>
+        <w:t xml:space="preserve"> se eligieron las tecnologías y el enfoque de desarrollo que se iba a utilizar para construir el simulador. Se decidió trabajar con HTML, CSS y JavaScript, debido a que permiten desarrollar aplicaciones web de manera directa, sin necesidad de </w:t>
+      </w:r>
+      <w:proofErr w:type="spellStart"/>
+      <w:r>
+        <w:rPr>
+          <w:rFonts w:ascii="Times New Roman" w:hAnsi="Times New Roman" w:cs="Times New Roman"/>
+        </w:rPr>
+        <w:t>frameworks</w:t>
+      </w:r>
+      <w:proofErr w:type="spellEnd"/>
+      <w:r>
+        <w:rPr>
+          <w:rFonts w:ascii="Times New Roman" w:hAnsi="Times New Roman" w:cs="Times New Roman"/>
+        </w:rPr>
+        <w:t xml:space="preserve"> complejos, y facilitan la representación visual de los algoritmos. En este caso, </w:t>
+      </w:r>
+      <w:r>
+        <w:rPr>
+          <w:rFonts w:ascii="Times New Roman" w:hAnsi="Times New Roman" w:cs="Times New Roman"/>
+        </w:rPr>
+        <w:lastRenderedPageBreak/>
+        <w:t>HTML se utilizó como la base estructural del sistema, JavaScript para toda la lógica de los algoritmos y el procesamiento de datos, y CSS para la parte visual e interfaz del usuario.</w:t>
       </w:r>
     </w:p>
     <w:p>
@@ -3809,15 +4171,16 @@
           <w:ilvl w:val="0"/>
           <w:numId w:val="8"/>
         </w:numPr>
-        <w:rPr>
-          <w:rFonts w:ascii="Times New Roman" w:hAnsi="Times New Roman" w:cs="Times New Roman"/>
-        </w:rPr>
-      </w:pPr>
-      <w:r>
-        <w:rPr>
-          <w:rFonts w:ascii="Times New Roman" w:hAnsi="Times New Roman" w:cs="Times New Roman"/>
-        </w:rPr>
-        <w:t xml:space="preserve">Se elige el bloque más pequeño que pueda contener el proceso. </w:t>
+        <w:jc w:val="both"/>
+        <w:rPr>
+          <w:rFonts w:ascii="Times New Roman" w:hAnsi="Times New Roman" w:cs="Times New Roman"/>
+        </w:rPr>
+      </w:pPr>
+      <w:r>
+        <w:rPr>
+          <w:rFonts w:ascii="Times New Roman" w:hAnsi="Times New Roman" w:cs="Times New Roman"/>
+        </w:rPr>
+        <w:t>Luego se definieron las entradas principales del sistema, las cuales son fundamentales para el funcionamiento tanto de la planificación de procesos como de la gestión de memoria. Estas entradas fueron: proceso, tiempo de llegada, tiempo de ejecución y tamaño. Cada uno de estos datos representa un aspecto importante del comportamiento de los procesos dentro del sistema operativo, permitiendo simular de manera más realista cómo se manejan los recursos de la computadora.</w:t>
       </w:r>
     </w:p>
     <w:p>
@@ -3827,41 +4190,502 @@
           <w:ilvl w:val="0"/>
           <w:numId w:val="8"/>
         </w:numPr>
-        <w:rPr>
-          <w:rFonts w:ascii="Times New Roman" w:hAnsi="Times New Roman" w:cs="Times New Roman"/>
-        </w:rPr>
-      </w:pPr>
-      <w:r>
-        <w:rPr>
-          <w:rFonts w:ascii="Times New Roman" w:hAnsi="Times New Roman" w:cs="Times New Roman"/>
-        </w:rPr>
-        <w:t xml:space="preserve">Busca optimizar el uso de memoria. </w:t>
-      </w:r>
-    </w:p>
-    <w:p>
-      <w:pPr>
-        <w:pStyle w:val="Ttulo3"/>
-      </w:pPr>
-      <w:r>
+        <w:jc w:val="both"/>
+        <w:rPr>
+          <w:rFonts w:ascii="Times New Roman" w:hAnsi="Times New Roman" w:cs="Times New Roman"/>
+        </w:rPr>
+      </w:pPr>
+      <w:r>
+        <w:rPr>
+          <w:rFonts w:ascii="Times New Roman" w:hAnsi="Times New Roman" w:cs="Times New Roman"/>
+        </w:rPr>
+        <w:t>Una parte importante de la implementación fue el manejo de datos mediante un archivo CSV, desde el cual el sistema lee la información de los procesos. Este archivo permite ingresar múltiples casos de prueba de forma ordenada, facilitando la simulación de diferentes escenarios sin necesidad de modificar el código. Una vez cargados los datos, estos son procesados y organizados internamente para ser utilizados por los distintos algoritmos.</w:t>
+      </w:r>
+    </w:p>
+    <w:p>
+      <w:pPr>
+        <w:pStyle w:val="Prrafodelista"/>
+        <w:numPr>
+          <w:ilvl w:val="0"/>
+          <w:numId w:val="8"/>
+        </w:numPr>
+        <w:jc w:val="both"/>
+        <w:rPr>
+          <w:rFonts w:ascii="Times New Roman" w:hAnsi="Times New Roman" w:cs="Times New Roman"/>
+        </w:rPr>
+      </w:pPr>
+      <w:r>
+        <w:rPr>
+          <w:rFonts w:ascii="Times New Roman" w:hAnsi="Times New Roman" w:cs="Times New Roman"/>
+        </w:rPr>
+        <w:t>Después de la lectura de datos, se procedió a la implementación de los algoritmos de planificación de procesos. Se desarrollaron los algoritmos FCFS, SPN, SRT y Round Robin, cada uno con su respectiva lógica de ejecución. En el caso de FCFS, los procesos se ejecutan según el orden de llegada; en SPN se selecciona el proceso con menor tiempo de ejecución; en SRT se permite la interrupción de procesos si llega uno con menor tiempo restante; y en Round Robin se utiliza una asignación por turnos mediante un quantum definido.</w:t>
+      </w:r>
+    </w:p>
+    <w:p>
+      <w:pPr>
+        <w:pStyle w:val="Prrafodelista"/>
+        <w:numPr>
+          <w:ilvl w:val="0"/>
+          <w:numId w:val="8"/>
+        </w:numPr>
+        <w:jc w:val="both"/>
+        <w:rPr>
+          <w:rFonts w:ascii="Times New Roman" w:hAnsi="Times New Roman" w:cs="Times New Roman"/>
+        </w:rPr>
+      </w:pPr>
+      <w:r>
+        <w:rPr>
+          <w:rFonts w:ascii="Times New Roman" w:hAnsi="Times New Roman" w:cs="Times New Roman"/>
+        </w:rPr>
+        <w:t xml:space="preserve">De forma paralela, también se implementó la gestión de memoria utilizando los algoritmos First </w:t>
+      </w:r>
+      <w:proofErr w:type="spellStart"/>
+      <w:r>
+        <w:rPr>
+          <w:rFonts w:ascii="Times New Roman" w:hAnsi="Times New Roman" w:cs="Times New Roman"/>
+        </w:rPr>
+        <w:t>Fit</w:t>
+      </w:r>
+      <w:proofErr w:type="spellEnd"/>
+      <w:r>
+        <w:rPr>
+          <w:rFonts w:ascii="Times New Roman" w:hAnsi="Times New Roman" w:cs="Times New Roman"/>
+        </w:rPr>
+        <w:t xml:space="preserve">, Best </w:t>
+      </w:r>
+      <w:proofErr w:type="spellStart"/>
+      <w:r>
+        <w:rPr>
+          <w:rFonts w:ascii="Times New Roman" w:hAnsi="Times New Roman" w:cs="Times New Roman"/>
+        </w:rPr>
+        <w:t>Fit</w:t>
+      </w:r>
+      <w:proofErr w:type="spellEnd"/>
+      <w:r>
+        <w:rPr>
+          <w:rFonts w:ascii="Times New Roman" w:hAnsi="Times New Roman" w:cs="Times New Roman"/>
+        </w:rPr>
+        <w:t xml:space="preserve"> y Worst </w:t>
+      </w:r>
+      <w:proofErr w:type="spellStart"/>
+      <w:r>
+        <w:rPr>
+          <w:rFonts w:ascii="Times New Roman" w:hAnsi="Times New Roman" w:cs="Times New Roman"/>
+        </w:rPr>
+        <w:t>Fit</w:t>
+      </w:r>
+      <w:proofErr w:type="spellEnd"/>
+      <w:r>
+        <w:rPr>
+          <w:rFonts w:ascii="Times New Roman" w:hAnsi="Times New Roman" w:cs="Times New Roman"/>
+        </w:rPr>
+        <w:t xml:space="preserve">. Estos algoritmos trabajan sobre los bloques de memoria disponibles y asignan espacio a los procesos según diferentes estrategias. First </w:t>
+      </w:r>
+      <w:proofErr w:type="spellStart"/>
+      <w:r>
+        <w:rPr>
+          <w:rFonts w:ascii="Times New Roman" w:hAnsi="Times New Roman" w:cs="Times New Roman"/>
+        </w:rPr>
+        <w:t>Fit</w:t>
+      </w:r>
+      <w:proofErr w:type="spellEnd"/>
+      <w:r>
+        <w:rPr>
+          <w:rFonts w:ascii="Times New Roman" w:hAnsi="Times New Roman" w:cs="Times New Roman"/>
+        </w:rPr>
+        <w:t xml:space="preserve"> asigna el primer bloque disponible que cumpla con el tamaño requerido, Best </w:t>
+      </w:r>
+      <w:proofErr w:type="spellStart"/>
+      <w:r>
+        <w:rPr>
+          <w:rFonts w:ascii="Times New Roman" w:hAnsi="Times New Roman" w:cs="Times New Roman"/>
+        </w:rPr>
+        <w:t>Fit</w:t>
+      </w:r>
+      <w:proofErr w:type="spellEnd"/>
+      <w:r>
+        <w:rPr>
+          <w:rFonts w:ascii="Times New Roman" w:hAnsi="Times New Roman" w:cs="Times New Roman"/>
+        </w:rPr>
+        <w:t xml:space="preserve"> busca el bloque más adecuado para minimizar desperdicio, y Worst </w:t>
+      </w:r>
+      <w:proofErr w:type="spellStart"/>
+      <w:r>
+        <w:rPr>
+          <w:rFonts w:ascii="Times New Roman" w:hAnsi="Times New Roman" w:cs="Times New Roman"/>
+        </w:rPr>
+        <w:t>Fit</w:t>
+      </w:r>
+      <w:proofErr w:type="spellEnd"/>
+      <w:r>
+        <w:rPr>
+          <w:rFonts w:ascii="Times New Roman" w:hAnsi="Times New Roman" w:cs="Times New Roman"/>
+        </w:rPr>
+        <w:t xml:space="preserve"> selecciona el bloque más grande con la intención de evitar fragmentación pequeña.</w:t>
+      </w:r>
+    </w:p>
+    <w:p>
+      <w:pPr>
+        <w:pStyle w:val="Prrafodelista"/>
+        <w:numPr>
+          <w:ilvl w:val="0"/>
+          <w:numId w:val="8"/>
+        </w:numPr>
+        <w:jc w:val="both"/>
+        <w:rPr>
+          <w:rFonts w:ascii="Times New Roman" w:hAnsi="Times New Roman" w:cs="Times New Roman"/>
+        </w:rPr>
+      </w:pPr>
+      <w:r>
+        <w:rPr>
+          <w:rFonts w:ascii="Times New Roman" w:hAnsi="Times New Roman" w:cs="Times New Roman"/>
+        </w:rPr>
+        <w:t>Una vez implementados los algoritmos, el sistema realiza el cálculo de diferentes métricas importantes para el análisis del rendimiento. Entre estas métricas se incluyen el tiempo de espera, el tiempo de finalización, el tiempo de retorno y los promedios generales. Estos valores permiten comparar el desempeño de cada algoritmo y analizar cuál es más eficiente dependiendo del escenario.</w:t>
+      </w:r>
+    </w:p>
+    <w:p>
+      <w:pPr>
+        <w:pStyle w:val="Prrafodelista"/>
+        <w:numPr>
+          <w:ilvl w:val="0"/>
+          <w:numId w:val="8"/>
+        </w:numPr>
+        <w:jc w:val="both"/>
+        <w:rPr>
+          <w:rFonts w:ascii="Times New Roman" w:hAnsi="Times New Roman" w:cs="Times New Roman"/>
+        </w:rPr>
+      </w:pPr>
+      <w:r>
+        <w:rPr>
+          <w:rFonts w:ascii="Times New Roman" w:hAnsi="Times New Roman" w:cs="Times New Roman"/>
+        </w:rPr>
+        <w:t>Además, el sistema genera diagramas de Gantt, los cuales representan visualmente la ejecución de los procesos en el tiempo. Estos diagramas son fundamentales para entender el comportamiento de cada algoritmo, ya que muestran el orden exacto de ejecución, los tiempos de inicio y finalización, y los posibles tiempos de espera.</w:t>
+      </w:r>
+    </w:p>
+    <w:p>
+      <w:pPr>
+        <w:pStyle w:val="Prrafodelista"/>
+        <w:numPr>
+          <w:ilvl w:val="0"/>
+          <w:numId w:val="8"/>
+        </w:numPr>
+        <w:jc w:val="both"/>
+        <w:rPr>
+          <w:rFonts w:ascii="Times New Roman" w:hAnsi="Times New Roman" w:cs="Times New Roman"/>
+        </w:rPr>
+      </w:pPr>
+      <w:r>
+        <w:rPr>
+          <w:rFonts w:ascii="Times New Roman" w:hAnsi="Times New Roman" w:cs="Times New Roman"/>
+        </w:rPr>
+        <w:t>Finalmente, la parte visual del sistema fue desarrollada utilizando CSS junto con HTML, lo que permitió construir una interfaz clara, organizada y fácil de usar. Se estructuraron dos secciones principales para la planificación de procesos y la gestión de memoria, permitiendo una comparación directa de los resultados. Gracias a esta implementación, el simulador no solo funciona correctamente a nivel lógico, sino que también ofrece una representación visual que facilita la comprensión de los algoritmos estudiados.</w:t>
+      </w:r>
+    </w:p>
+    <w:p>
+      <w:pPr>
+        <w:pStyle w:val="Ttulo2"/>
+      </w:pPr>
+      <w:r>
+        <w:t>5. Interfaz gráfica</w:t>
+      </w:r>
+    </w:p>
+    <w:p>
+      <w:pPr>
+        <w:jc w:val="both"/>
+        <w:rPr>
+          <w:rFonts w:ascii="Times New Roman" w:hAnsi="Times New Roman" w:cs="Times New Roman"/>
+        </w:rPr>
+      </w:pPr>
+      <w:r>
+        <w:rPr>
+          <w:rFonts w:ascii="Times New Roman" w:hAnsi="Times New Roman" w:cs="Times New Roman"/>
+        </w:rPr>
+        <w:t>La interfaz gráfica del sistema fue diseñada con el objetivo de facilitar la interacción del usuario y permitir una comprensión más clara de los resultados obtenidos durante la simulación de los algoritmos. La organización de la interfaz se realizó de manera modular, separando las funcionalidades principales para evitar confusión y mejorar la experiencia de uso.</w:t>
+      </w:r>
+    </w:p>
+    <w:p>
+      <w:pPr>
+        <w:jc w:val="both"/>
+        <w:rPr>
+          <w:rFonts w:ascii="Times New Roman" w:hAnsi="Times New Roman" w:cs="Times New Roman"/>
+        </w:rPr>
+      </w:pPr>
+      <w:r>
+        <w:rPr>
+          <w:rFonts w:ascii="Times New Roman" w:hAnsi="Times New Roman" w:cs="Times New Roman"/>
+        </w:rPr>
+        <w:t>En el lado izquierdo se implementó un panel de navegación que permite alternar entre los dos módulos principales del sistema: planificación de procesos y gestión de memoria. Este panel funciona como un selector principal, lo que permite al usuario cambiar de sección de manera rápida sin necesidad de recargar la página. Además, este diseño ayuda a mantener el sistema ordenado y evita mezclar información de ambos módulos.</w:t>
+      </w:r>
+    </w:p>
+    <w:p>
+      <w:pPr>
+        <w:jc w:val="both"/>
+        <w:rPr>
+          <w:rFonts w:ascii="Times New Roman" w:hAnsi="Times New Roman" w:cs="Times New Roman"/>
+        </w:rPr>
+      </w:pPr>
+      <w:r>
+        <w:rPr>
+          <w:rFonts w:ascii="Times New Roman" w:hAnsi="Times New Roman" w:cs="Times New Roman"/>
+        </w:rPr>
+        <w:lastRenderedPageBreak/>
+        <w:t>En la parte superior se encuentra el área de carga de datos, donde el usuario puede seleccionar el archivo CSV que contiene los procesos a simular. Este archivo es común para ambos módulos, ya que contiene la información base necesaria para la planificación y la asignación de memoria. En esta misma sección también se encuentran los controles para seleccionar el algoritmo que se desea ejecutar, lo que permite iniciar la simulación de forma directa dependiendo del análisis que se quiera realizar.</w:t>
+      </w:r>
+    </w:p>
+    <w:p>
+      <w:pPr>
+        <w:jc w:val="both"/>
+        <w:rPr>
+          <w:rFonts w:ascii="Times New Roman" w:hAnsi="Times New Roman" w:cs="Times New Roman"/>
+        </w:rPr>
+      </w:pPr>
+      <w:r>
+        <w:rPr>
+          <w:rFonts w:ascii="Times New Roman" w:hAnsi="Times New Roman" w:cs="Times New Roman"/>
+        </w:rPr>
+        <w:t>En el centro de la interfaz se ubica la tabla principal de procesos, donde se visualizan todos los datos cargados desde el CSV. Esta tabla permite verificar la información de entrada antes de ejecutar los algoritmos y sirve como referencia para el análisis de resultados. Debajo o junto a esta tabla se presentan los diagramas de Gantt, los cuales muestran de manera gráfica la ejecución de los procesos en el tiempo según el algoritmo seleccionado. Estos diagramas permiten observar claramente el orden de ejecución, los tiempos de espera y la duración de cada proceso.</w:t>
+      </w:r>
+    </w:p>
+    <w:p>
+      <w:pPr>
+        <w:jc w:val="both"/>
+        <w:rPr>
+          <w:rFonts w:ascii="Times New Roman" w:hAnsi="Times New Roman" w:cs="Times New Roman"/>
+        </w:rPr>
+      </w:pPr>
+      <w:r>
+        <w:rPr>
+          <w:rFonts w:ascii="Times New Roman" w:hAnsi="Times New Roman" w:cs="Times New Roman"/>
+        </w:rPr>
+        <w:t>En el lado derecho se muestran los resultados finales del sistema. En esta sección se presentan los promedios calculados, como el tiempo de espera promedio y el tiempo de retorno, además de los detalles individuales de cada proceso. También se indica qué algoritmo fue utilizado en la simulación, lo que facilita la comparación entre diferentes métodos de planificación y gestión de memoria.</w:t>
+      </w:r>
+    </w:p>
+    <w:p>
+      <w:pPr>
+        <w:jc w:val="both"/>
+        <w:rPr>
+          <w:rFonts w:ascii="Times New Roman" w:hAnsi="Times New Roman" w:cs="Times New Roman"/>
+        </w:rPr>
+      </w:pPr>
+      <w:r>
+        <w:rPr>
+          <w:rFonts w:ascii="Times New Roman" w:hAnsi="Times New Roman" w:cs="Times New Roman"/>
+        </w:rPr>
+        <w:t>Por otra parte, en el módulo de gestión de memoria se añadió una representación basada en particiones de memoria, lo que permite visualizar cómo se divide la memoria disponible en bloques. Esta representación es importante porque ayuda a entender de forma más intuitiva cómo funcionan los algoritmos de asignación como</w:t>
+      </w:r>
+      <w:r>
+        <w:rPr>
+          <w:rFonts w:ascii="Times New Roman" w:hAnsi="Times New Roman" w:cs="Times New Roman"/>
+        </w:rPr>
+        <w:t>:</w:t>
+      </w:r>
+    </w:p>
+    <w:p>
+      <w:pPr>
+        <w:pStyle w:val="Prrafodelista"/>
+        <w:numPr>
+          <w:ilvl w:val="0"/>
+          <w:numId w:val="12"/>
+        </w:numPr>
+        <w:jc w:val="both"/>
+        <w:rPr>
+          <w:rFonts w:ascii="Times New Roman" w:hAnsi="Times New Roman" w:cs="Times New Roman"/>
+        </w:rPr>
+      </w:pPr>
+      <w:r>
+        <w:rPr>
+          <w:rFonts w:ascii="Times New Roman" w:hAnsi="Times New Roman" w:cs="Times New Roman"/>
+        </w:rPr>
+        <w:t xml:space="preserve">First </w:t>
+      </w:r>
+      <w:proofErr w:type="spellStart"/>
+      <w:r>
+        <w:rPr>
+          <w:rFonts w:ascii="Times New Roman" w:hAnsi="Times New Roman" w:cs="Times New Roman"/>
+        </w:rPr>
+        <w:t>Fit</w:t>
+      </w:r>
+      <w:proofErr w:type="spellEnd"/>
+    </w:p>
+    <w:p>
+      <w:pPr>
+        <w:pStyle w:val="Prrafodelista"/>
+        <w:numPr>
+          <w:ilvl w:val="0"/>
+          <w:numId w:val="12"/>
+        </w:numPr>
+        <w:jc w:val="both"/>
+        <w:rPr>
+          <w:rFonts w:ascii="Times New Roman" w:hAnsi="Times New Roman" w:cs="Times New Roman"/>
+        </w:rPr>
+      </w:pPr>
+      <w:r>
+        <w:rPr>
+          <w:rFonts w:ascii="Times New Roman" w:hAnsi="Times New Roman" w:cs="Times New Roman"/>
+        </w:rPr>
+        <w:t xml:space="preserve">Best </w:t>
+      </w:r>
+      <w:proofErr w:type="spellStart"/>
+      <w:r>
+        <w:rPr>
+          <w:rFonts w:ascii="Times New Roman" w:hAnsi="Times New Roman" w:cs="Times New Roman"/>
+        </w:rPr>
+        <w:t>Fit</w:t>
+      </w:r>
+      <w:proofErr w:type="spellEnd"/>
+    </w:p>
+    <w:p>
+      <w:pPr>
+        <w:pStyle w:val="Prrafodelista"/>
+        <w:numPr>
+          <w:ilvl w:val="0"/>
+          <w:numId w:val="12"/>
+        </w:numPr>
+        <w:jc w:val="both"/>
+        <w:rPr>
+          <w:rFonts w:ascii="Times New Roman" w:hAnsi="Times New Roman" w:cs="Times New Roman"/>
+        </w:rPr>
+      </w:pPr>
+      <w:r>
+        <w:rPr>
+          <w:rFonts w:ascii="Times New Roman" w:hAnsi="Times New Roman" w:cs="Times New Roman"/>
+        </w:rPr>
         <w:t xml:space="preserve">Worst </w:t>
       </w:r>
       <w:proofErr w:type="spellStart"/>
       <w:r>
+        <w:rPr>
+          <w:rFonts w:ascii="Times New Roman" w:hAnsi="Times New Roman" w:cs="Times New Roman"/>
+        </w:rPr>
         <w:t>Fit</w:t>
       </w:r>
       <w:proofErr w:type="spellEnd"/>
-    </w:p>
-    <w:p>
-      <w:pPr>
-        <w:rPr>
-          <w:rFonts w:ascii="Times New Roman" w:hAnsi="Times New Roman" w:cs="Times New Roman"/>
-        </w:rPr>
-      </w:pPr>
-      <w:r>
-        <w:rPr>
-          <w:rFonts w:ascii="Times New Roman" w:hAnsi="Times New Roman" w:cs="Times New Roman"/>
-        </w:rPr>
-        <w:t xml:space="preserve">El algoritmo Worst </w:t>
+      <w:r>
+        <w:rPr>
+          <w:rFonts w:ascii="Times New Roman" w:hAnsi="Times New Roman" w:cs="Times New Roman"/>
+        </w:rPr>
+        <w:t>,</w:t>
+      </w:r>
+    </w:p>
+    <w:p>
+      <w:pPr>
+        <w:jc w:val="both"/>
+        <w:rPr>
+          <w:rFonts w:ascii="Times New Roman" w:hAnsi="Times New Roman" w:cs="Times New Roman"/>
+        </w:rPr>
+      </w:pPr>
+      <w:r>
+        <w:rPr>
+          <w:rFonts w:ascii="Times New Roman" w:hAnsi="Times New Roman" w:cs="Times New Roman"/>
+        </w:rPr>
+        <w:t xml:space="preserve"> mostrando cómo cada proceso ocupa espacios específicos en la memoria y cómo se van liberando los bloques a medida que finalizan los procesos.</w:t>
+      </w:r>
+    </w:p>
+    <w:p>
+      <w:pPr>
+        <w:jc w:val="both"/>
+        <w:rPr>
+          <w:rFonts w:ascii="Times New Roman" w:hAnsi="Times New Roman" w:cs="Times New Roman"/>
+        </w:rPr>
+      </w:pPr>
+      <w:r>
+        <w:rPr>
+          <w:rFonts w:ascii="Times New Roman" w:hAnsi="Times New Roman" w:cs="Times New Roman"/>
+        </w:rPr>
+        <w:t>Adicionalmente, la interfaz fue diseñada pensando en la claridad visual, utilizando una distribución en columnas que separa entrada de datos, visualización y resultados. Esto permite que el usuario pueda seguir el flujo completo de la simulación de forma ordenada: desde la carga del CSV, pasando por la ejecución del algoritmo, hasta la visualización de los resultados finales.</w:t>
+      </w:r>
+    </w:p>
+    <w:p>
+      <w:pPr>
+        <w:jc w:val="both"/>
+        <w:rPr>
+          <w:rFonts w:ascii="Times New Roman" w:hAnsi="Times New Roman" w:cs="Times New Roman"/>
+        </w:rPr>
+      </w:pPr>
+      <w:r>
+        <w:rPr>
+          <w:rFonts w:ascii="Times New Roman" w:hAnsi="Times New Roman" w:cs="Times New Roman"/>
+        </w:rPr>
+        <w:t>Finalmente, el uso de HTML y CSS permitió construir una interfaz ligera pero funcional, donde la información se presenta de forma estructurada y fácil de interpretar, haciendo que el simulador sea una herramienta práctica para el análisis de algoritmos de sistemas operativos.</w:t>
+      </w:r>
+    </w:p>
+    <w:p>
+      <w:pPr>
+        <w:pStyle w:val="Ttulo2"/>
+      </w:pPr>
+      <w:r>
+        <w:t>6. Entrada de datos</w:t>
+      </w:r>
+    </w:p>
+    <w:p>
+      <w:pPr>
+        <w:jc w:val="both"/>
+        <w:rPr>
+          <w:rFonts w:ascii="Times New Roman" w:hAnsi="Times New Roman" w:cs="Times New Roman"/>
+        </w:rPr>
+      </w:pPr>
+      <w:r>
+        <w:rPr>
+          <w:rFonts w:ascii="Times New Roman" w:hAnsi="Times New Roman" w:cs="Times New Roman"/>
+        </w:rPr>
+        <w:t>El sistema utiliza como base un conjunto de datos que se ingresan mediante un archivo CSV o de forma manual, los cuales representan los procesos que serán utilizados tanto en la planificación de procesos como en la gestión de memoria. Las entradas principales son: identificador del proceso, tiempo de llegada, tiempo de ejecución (o ráfaga de CPU) y tamaño de memoria.</w:t>
+      </w:r>
+    </w:p>
+    <w:p>
+      <w:pPr>
+        <w:jc w:val="both"/>
+        <w:rPr>
+          <w:rFonts w:ascii="Times New Roman" w:hAnsi="Times New Roman" w:cs="Times New Roman"/>
+        </w:rPr>
+      </w:pPr>
+      <w:r>
+        <w:rPr>
+          <w:rFonts w:ascii="Times New Roman" w:hAnsi="Times New Roman" w:cs="Times New Roman"/>
+        </w:rPr>
+        <w:t>Cuando el usuario carga el archivo CSV, el sistema realiza automáticamente la lectura del contenido mediante un lector de archivos. Luego, cada fila del archivo es procesada y convertida en un objeto interno del sistema. Durante este proceso, se validan los datos para asegurar que cada proceso tenga al menos un identificador, un tiempo de llegada y un tiempo de ejecución válido. Si algún dato no cumple con estos requisitos, el proceso es ignorado.</w:t>
+      </w:r>
+    </w:p>
+    <w:p>
+      <w:pPr>
+        <w:jc w:val="both"/>
+        <w:rPr>
+          <w:rFonts w:ascii="Times New Roman" w:hAnsi="Times New Roman" w:cs="Times New Roman"/>
+        </w:rPr>
+      </w:pPr>
+      <w:r>
+        <w:rPr>
+          <w:rFonts w:ascii="Times New Roman" w:hAnsi="Times New Roman" w:cs="Times New Roman"/>
+        </w:rPr>
+        <w:t>Una vez cargados los procesos, estos quedan almacenados en una estructura interna, lo que permite que sean utilizados por todos los algoritmos del sistema sin necesidad de volver a cargar el archivo. A partir de este momento, los datos pueden ser utilizados tanto para la planificación de CPU como para la simulación de memoria.</w:t>
+      </w:r>
+    </w:p>
+    <w:p>
+      <w:pPr>
+        <w:jc w:val="both"/>
+        <w:rPr>
+          <w:rFonts w:ascii="Times New Roman" w:hAnsi="Times New Roman" w:cs="Times New Roman"/>
+        </w:rPr>
+      </w:pPr>
+      <w:r>
+        <w:rPr>
+          <w:rFonts w:ascii="Times New Roman" w:hAnsi="Times New Roman" w:cs="Times New Roman"/>
+        </w:rPr>
+        <w:lastRenderedPageBreak/>
+        <w:t>En la planificación de procesos, cada algoritmo utiliza estos datos de manera diferente. Por ejemplo, el tiempo de llegada determina cuándo un proceso puede empezar a ser considerado, mientras que el tiempo de ejecución define cuánto tiempo necesita la CPU. Según el algoritmo seleccionado (FCFS, SPN, SRT o Round Robin), el sistema reorganiza o administra la ejecución de los procesos, generando resultados como tiempos de inicio, finalización, espera y retorno.</w:t>
+      </w:r>
+    </w:p>
+    <w:p>
+      <w:pPr>
+        <w:jc w:val="both"/>
+        <w:rPr>
+          <w:rFonts w:ascii="Times New Roman" w:hAnsi="Times New Roman" w:cs="Times New Roman"/>
+        </w:rPr>
+      </w:pPr>
+      <w:r>
+        <w:rPr>
+          <w:rFonts w:ascii="Times New Roman" w:hAnsi="Times New Roman" w:cs="Times New Roman"/>
+        </w:rPr>
+        <w:t xml:space="preserve">En la gestión de memoria, el mismo conjunto de procesos se utiliza, pero ahora el campo más importante es el tamaño de memoria. Cada proceso intenta ser asignado a un bloque disponible dependiendo del algoritmo seleccionado (First </w:t>
       </w:r>
       <w:proofErr w:type="spellStart"/>
       <w:r>
@@ -3875,7 +4699,7 @@
         <w:rPr>
           <w:rFonts w:ascii="Times New Roman" w:hAnsi="Times New Roman" w:cs="Times New Roman"/>
         </w:rPr>
-        <w:t xml:space="preserve"> hace lo contrario al Best </w:t>
+        <w:t xml:space="preserve">, Best </w:t>
       </w:r>
       <w:proofErr w:type="spellStart"/>
       <w:r>
@@ -3889,33 +4713,99 @@
         <w:rPr>
           <w:rFonts w:ascii="Times New Roman" w:hAnsi="Times New Roman" w:cs="Times New Roman"/>
         </w:rPr>
-        <w:t>, ya que selecciona el bloque de memoria más grande disponible para asignar un proceso. La idea es dejar espacios grandes libres después de la asignación, con la esperanza de que puedan ser útiles para procesos futuros.</w:t>
-      </w:r>
-    </w:p>
-    <w:p>
-      <w:pPr>
-        <w:rPr>
-          <w:rFonts w:ascii="Times New Roman" w:hAnsi="Times New Roman" w:cs="Times New Roman"/>
-        </w:rPr>
-      </w:pPr>
-      <w:r>
-        <w:rPr>
-          <w:rFonts w:ascii="Times New Roman" w:hAnsi="Times New Roman" w:cs="Times New Roman"/>
-        </w:rPr>
-        <w:t>Este enfoque puede parecer útil al inicio, pero en la práctica puede desperdiciar memoria, ya que los grandes bloques se van fragmentando de forma poco eficiente. Además, no siempre garantiza un buen aprovechamiento del espacio.</w:t>
-      </w:r>
-    </w:p>
-    <w:p>
-      <w:pPr>
-        <w:rPr>
-          <w:rFonts w:ascii="Times New Roman" w:hAnsi="Times New Roman" w:cs="Times New Roman"/>
-        </w:rPr>
-      </w:pPr>
-      <w:r>
-        <w:rPr>
-          <w:rFonts w:ascii="Times New Roman" w:hAnsi="Times New Roman" w:cs="Times New Roman"/>
-        </w:rPr>
-        <w:t>En su funcionamiento:</w:t>
+        <w:t xml:space="preserve"> o Worst </w:t>
+      </w:r>
+      <w:proofErr w:type="spellStart"/>
+      <w:r>
+        <w:rPr>
+          <w:rFonts w:ascii="Times New Roman" w:hAnsi="Times New Roman" w:cs="Times New Roman"/>
+        </w:rPr>
+        <w:t>Fit</w:t>
+      </w:r>
+      <w:proofErr w:type="spellEnd"/>
+      <w:r>
+        <w:rPr>
+          <w:rFonts w:ascii="Times New Roman" w:hAnsi="Times New Roman" w:cs="Times New Roman"/>
+        </w:rPr>
+        <w:t>). El sistema analiza los bloques de memoria libres y decide si el proceso puede ser asignado o si debe ser rechazado por falta de espacio.</w:t>
+      </w:r>
+    </w:p>
+    <w:p>
+      <w:pPr>
+        <w:jc w:val="both"/>
+        <w:rPr>
+          <w:rFonts w:ascii="Times New Roman" w:hAnsi="Times New Roman" w:cs="Times New Roman"/>
+        </w:rPr>
+      </w:pPr>
+      <w:r>
+        <w:rPr>
+          <w:rFonts w:ascii="Times New Roman" w:hAnsi="Times New Roman" w:cs="Times New Roman"/>
+        </w:rPr>
+        <w:t>Además, cuando se utiliza la modalidad de particiones fijas, la memoria se divide en bloques definidos por el usuario, lo que permite observar cómo cada proceso ocupa una partición específica. En cambio, en la modalidad dinámica, la memoria se comporta como un espacio continuo, donde los bloques se crean y liberan conforme los procesos entran y salen.</w:t>
+      </w:r>
+    </w:p>
+    <w:p>
+      <w:pPr>
+        <w:jc w:val="both"/>
+        <w:rPr>
+          <w:rFonts w:ascii="Times New Roman" w:hAnsi="Times New Roman" w:cs="Times New Roman"/>
+        </w:rPr>
+      </w:pPr>
+      <w:r>
+        <w:rPr>
+          <w:rFonts w:ascii="Times New Roman" w:hAnsi="Times New Roman" w:cs="Times New Roman"/>
+        </w:rPr>
+        <w:t>En ambos casos, el sistema actualiza en tiempo real los resultados, mostrando estadísticas como memoria usada, memoria libre, procesos asignados y procesos rechazados. Esto permite analizar el comportamiento del sistema bajo diferentes condiciones y comparar el rendimiento de los algoritmos implementados.</w:t>
+      </w:r>
+    </w:p>
+    <w:p>
+      <w:pPr>
+        <w:jc w:val="both"/>
+        <w:rPr>
+          <w:rFonts w:ascii="Times New Roman" w:hAnsi="Times New Roman" w:cs="Times New Roman"/>
+        </w:rPr>
+      </w:pPr>
+      <w:r>
+        <w:rPr>
+          <w:rFonts w:ascii="Times New Roman" w:hAnsi="Times New Roman" w:cs="Times New Roman"/>
+        </w:rPr>
+        <w:t>Finalmente, el comportamiento general del sistema está diseñado para ser dinámico e interactivo, permitiendo que cada cambio en los datos de entrada se refleje inmediatamente en las simulaciones, tanto en la planificación de procesos como en la gestión de memoria.</w:t>
+      </w:r>
+    </w:p>
+    <w:p>
+      <w:pPr>
+        <w:pStyle w:val="Ttulo2"/>
+      </w:pPr>
+      <w:r>
+        <w:t>7. Cálculo de métricas</w:t>
+      </w:r>
+    </w:p>
+    <w:p>
+      <w:pPr>
+        <w:jc w:val="both"/>
+        <w:rPr>
+          <w:rFonts w:ascii="Times New Roman" w:hAnsi="Times New Roman" w:cs="Times New Roman"/>
+        </w:rPr>
+      </w:pPr>
+      <w:r>
+        <w:rPr>
+          <w:rFonts w:ascii="Times New Roman" w:hAnsi="Times New Roman" w:cs="Times New Roman"/>
+        </w:rPr>
+        <w:t>El sistema implementado no solo se encarga de simular la ejecución de los procesos, sino que también realiza el cálculo de distintas métricas que permiten analizar el rendimiento de los algoritmos de planificación. Estas métricas son fundamentales para comparar el comportamiento de cada algoritmo y determinar su eficiencia en distintos escenarios.</w:t>
+      </w:r>
+    </w:p>
+    <w:p>
+      <w:pPr>
+        <w:jc w:val="both"/>
+        <w:rPr>
+          <w:rFonts w:ascii="Times New Roman" w:hAnsi="Times New Roman" w:cs="Times New Roman"/>
+        </w:rPr>
+      </w:pPr>
+      <w:r>
+        <w:rPr>
+          <w:rFonts w:ascii="Times New Roman" w:hAnsi="Times New Roman" w:cs="Times New Roman"/>
+        </w:rPr>
+        <w:t>En la planificación de procesos, una vez finalizada la simulación, el sistema calcula automáticamente los siguientes valores para cada proceso:</w:t>
       </w:r>
     </w:p>
     <w:p>
@@ -3925,15 +4815,16 @@
           <w:ilvl w:val="0"/>
           <w:numId w:val="9"/>
         </w:numPr>
-        <w:rPr>
-          <w:rFonts w:ascii="Times New Roman" w:hAnsi="Times New Roman" w:cs="Times New Roman"/>
-        </w:rPr>
-      </w:pPr>
-      <w:r>
-        <w:rPr>
-          <w:rFonts w:ascii="Times New Roman" w:hAnsi="Times New Roman" w:cs="Times New Roman"/>
-        </w:rPr>
-        <w:t xml:space="preserve">Se busca el bloque más grande disponible. </w:t>
+        <w:jc w:val="both"/>
+        <w:rPr>
+          <w:rFonts w:ascii="Times New Roman" w:hAnsi="Times New Roman" w:cs="Times New Roman"/>
+        </w:rPr>
+      </w:pPr>
+      <w:r>
+        <w:rPr>
+          <w:rFonts w:ascii="Times New Roman" w:hAnsi="Times New Roman" w:cs="Times New Roman"/>
+        </w:rPr>
+        <w:t xml:space="preserve">Tiempo de inicio: momento en el que el proceso comienza su ejecución en la CPU. </w:t>
       </w:r>
     </w:p>
     <w:p>
@@ -3943,15 +4834,16 @@
           <w:ilvl w:val="0"/>
           <w:numId w:val="9"/>
         </w:numPr>
-        <w:rPr>
-          <w:rFonts w:ascii="Times New Roman" w:hAnsi="Times New Roman" w:cs="Times New Roman"/>
-        </w:rPr>
-      </w:pPr>
-      <w:r>
-        <w:rPr>
-          <w:rFonts w:ascii="Times New Roman" w:hAnsi="Times New Roman" w:cs="Times New Roman"/>
-        </w:rPr>
-        <w:t xml:space="preserve">Se asigna el proceso a ese bloque. </w:t>
+        <w:jc w:val="both"/>
+        <w:rPr>
+          <w:rFonts w:ascii="Times New Roman" w:hAnsi="Times New Roman" w:cs="Times New Roman"/>
+        </w:rPr>
+      </w:pPr>
+      <w:r>
+        <w:rPr>
+          <w:rFonts w:ascii="Times New Roman" w:hAnsi="Times New Roman" w:cs="Times New Roman"/>
+        </w:rPr>
+        <w:t xml:space="preserve">Tiempo de finalización: instante en el que el proceso termina completamente su ejecución. </w:t>
       </w:r>
     </w:p>
     <w:p>
@@ -3961,37 +4853,6 @@
           <w:ilvl w:val="0"/>
           <w:numId w:val="9"/>
         </w:numPr>
-        <w:rPr>
-          <w:rFonts w:ascii="Times New Roman" w:hAnsi="Times New Roman" w:cs="Times New Roman"/>
-        </w:rPr>
-      </w:pPr>
-      <w:r>
-        <w:rPr>
-          <w:rFonts w:ascii="Times New Roman" w:hAnsi="Times New Roman" w:cs="Times New Roman"/>
-        </w:rPr>
-        <w:t>Intenta evitar fragmentos pequeños, aunque no siempre lo logra.</w:t>
-      </w:r>
-    </w:p>
-    <w:p>
-      <w:pPr>
-        <w:pStyle w:val="Ttulo2"/>
-      </w:pPr>
-      <w:r>
-        <w:rPr>
-          <w:rFonts w:asciiTheme="minorHAnsi" w:eastAsiaTheme="minorHAnsi" w:hAnsiTheme="minorHAnsi" w:cstheme="minorBidi"/>
-          <w:bCs/>
-          <w:color w:val="auto"/>
-          <w:sz w:val="22"/>
-          <w:szCs w:val="22"/>
-        </w:rPr>
-        <w:t>.</w:t>
-      </w:r>
-      <w:r>
-        <w:t>4. Implementación del sistema</w:t>
-      </w:r>
-    </w:p>
-    <w:p>
-      <w:pPr>
         <w:jc w:val="both"/>
         <w:rPr>
           <w:rFonts w:ascii="Times New Roman" w:hAnsi="Times New Roman" w:cs="Times New Roman"/>
@@ -4001,710 +4862,7 @@
         <w:rPr>
           <w:rFonts w:ascii="Times New Roman" w:hAnsi="Times New Roman" w:cs="Times New Roman"/>
         </w:rPr>
-        <w:t xml:space="preserve">Para la implementación del sistemas, en primer lugar </w:t>
-      </w:r>
-      <w:proofErr w:type="spellStart"/>
-      <w:r>
-        <w:rPr>
-          <w:rFonts w:ascii="Times New Roman" w:hAnsi="Times New Roman" w:cs="Times New Roman"/>
-        </w:rPr>
-        <w:t>elgiemos</w:t>
-      </w:r>
-      <w:proofErr w:type="spellEnd"/>
-      <w:r>
-        <w:rPr>
-          <w:rFonts w:ascii="Times New Roman" w:hAnsi="Times New Roman" w:cs="Times New Roman"/>
-        </w:rPr>
-        <w:t xml:space="preserve"> en que lenguaje se va realizar la implementación del simulador y por ende decidí el </w:t>
-      </w:r>
-      <w:proofErr w:type="spellStart"/>
-      <w:r>
-        <w:rPr>
-          <w:rFonts w:ascii="Times New Roman" w:hAnsi="Times New Roman" w:cs="Times New Roman"/>
-        </w:rPr>
-        <w:t>html</w:t>
-      </w:r>
-      <w:proofErr w:type="spellEnd"/>
-      <w:r>
-        <w:rPr>
-          <w:rFonts w:ascii="Times New Roman" w:hAnsi="Times New Roman" w:cs="Times New Roman"/>
-        </w:rPr>
-        <w:t xml:space="preserve"> ya que es </w:t>
-      </w:r>
-      <w:proofErr w:type="spellStart"/>
-      <w:r>
-        <w:rPr>
-          <w:rFonts w:ascii="Times New Roman" w:hAnsi="Times New Roman" w:cs="Times New Roman"/>
-        </w:rPr>
-        <w:t>es</w:t>
-      </w:r>
-      <w:proofErr w:type="spellEnd"/>
-      <w:r>
-        <w:rPr>
-          <w:rFonts w:ascii="Times New Roman" w:hAnsi="Times New Roman" w:cs="Times New Roman"/>
-        </w:rPr>
-        <w:t xml:space="preserve"> </w:t>
-      </w:r>
-      <w:proofErr w:type="spellStart"/>
-      <w:r>
-        <w:rPr>
-          <w:rFonts w:ascii="Times New Roman" w:hAnsi="Times New Roman" w:cs="Times New Roman"/>
-        </w:rPr>
-        <w:t>mas</w:t>
-      </w:r>
-      <w:proofErr w:type="spellEnd"/>
-      <w:r>
-        <w:rPr>
-          <w:rFonts w:ascii="Times New Roman" w:hAnsi="Times New Roman" w:cs="Times New Roman"/>
-        </w:rPr>
-        <w:t xml:space="preserve"> fácil de elaborarlo y </w:t>
-      </w:r>
-      <w:proofErr w:type="spellStart"/>
-      <w:r>
-        <w:rPr>
-          <w:rFonts w:ascii="Times New Roman" w:hAnsi="Times New Roman" w:cs="Times New Roman"/>
-        </w:rPr>
-        <w:t>ademas</w:t>
-      </w:r>
-      <w:proofErr w:type="spellEnd"/>
-      <w:r>
-        <w:rPr>
-          <w:rFonts w:ascii="Times New Roman" w:hAnsi="Times New Roman" w:cs="Times New Roman"/>
-        </w:rPr>
-        <w:t xml:space="preserve"> amigable a la hora de </w:t>
-      </w:r>
-      <w:proofErr w:type="spellStart"/>
-      <w:r>
-        <w:rPr>
-          <w:rFonts w:ascii="Times New Roman" w:hAnsi="Times New Roman" w:cs="Times New Roman"/>
-        </w:rPr>
-        <w:t>progrmar</w:t>
-      </w:r>
-      <w:proofErr w:type="spellEnd"/>
-      <w:r>
-        <w:rPr>
-          <w:rFonts w:ascii="Times New Roman" w:hAnsi="Times New Roman" w:cs="Times New Roman"/>
-        </w:rPr>
-        <w:t>.</w:t>
-      </w:r>
-    </w:p>
-    <w:p>
-      <w:pPr>
-        <w:jc w:val="both"/>
-        <w:rPr>
-          <w:rFonts w:ascii="Times New Roman" w:hAnsi="Times New Roman" w:cs="Times New Roman"/>
-        </w:rPr>
-      </w:pPr>
-      <w:r>
-        <w:rPr>
-          <w:rFonts w:ascii="Times New Roman" w:hAnsi="Times New Roman" w:cs="Times New Roman"/>
-        </w:rPr>
-        <w:t xml:space="preserve">Luego estaría definir las entradas que se va a tener que </w:t>
-      </w:r>
-      <w:proofErr w:type="spellStart"/>
-      <w:r>
-        <w:rPr>
-          <w:rFonts w:ascii="Times New Roman" w:hAnsi="Times New Roman" w:cs="Times New Roman"/>
-        </w:rPr>
-        <w:t>tuvimo</w:t>
-      </w:r>
-      <w:proofErr w:type="spellEnd"/>
-      <w:r>
-        <w:rPr>
-          <w:rFonts w:ascii="Times New Roman" w:hAnsi="Times New Roman" w:cs="Times New Roman"/>
-        </w:rPr>
-        <w:t xml:space="preserve"> en consideración 4 que son proceso, tiempo de llegada, </w:t>
-      </w:r>
-    </w:p>
-    <w:p>
-      <w:pPr>
-        <w:jc w:val="both"/>
-        <w:rPr>
-          <w:rFonts w:ascii="Times New Roman" w:hAnsi="Times New Roman" w:cs="Times New Roman"/>
-        </w:rPr>
-      </w:pPr>
-      <w:r>
-        <w:rPr>
-          <w:rFonts w:ascii="Times New Roman" w:hAnsi="Times New Roman" w:cs="Times New Roman"/>
-        </w:rPr>
-        <w:t xml:space="preserve">Para la implementación del sistema, en primer lugar se importaron las librerías necesarias de Python, entre ellas </w:t>
-      </w:r>
-      <w:proofErr w:type="spellStart"/>
-      <w:r>
-        <w:rPr>
-          <w:rFonts w:ascii="Times New Roman" w:hAnsi="Times New Roman" w:cs="Times New Roman"/>
-        </w:rPr>
-        <w:t>csv</w:t>
-      </w:r>
-      <w:proofErr w:type="spellEnd"/>
-      <w:r>
-        <w:rPr>
-          <w:rFonts w:ascii="Times New Roman" w:hAnsi="Times New Roman" w:cs="Times New Roman"/>
-        </w:rPr>
-        <w:t xml:space="preserve">, utilizada para la lectura de archivos de datos; </w:t>
-      </w:r>
-      <w:proofErr w:type="spellStart"/>
-      <w:r>
-        <w:rPr>
-          <w:rFonts w:ascii="Times New Roman" w:hAnsi="Times New Roman" w:cs="Times New Roman"/>
-        </w:rPr>
-        <w:t>tkinter</w:t>
-      </w:r>
-      <w:proofErr w:type="spellEnd"/>
-      <w:r>
-        <w:rPr>
-          <w:rFonts w:ascii="Times New Roman" w:hAnsi="Times New Roman" w:cs="Times New Roman"/>
-        </w:rPr>
-        <w:t xml:space="preserve">, empleada para el desarrollo de la interfaz gráfica; y </w:t>
-      </w:r>
-      <w:proofErr w:type="spellStart"/>
-      <w:r>
-        <w:rPr>
-          <w:rFonts w:ascii="Times New Roman" w:hAnsi="Times New Roman" w:cs="Times New Roman"/>
-        </w:rPr>
-        <w:t>matplotlib</w:t>
-      </w:r>
-      <w:proofErr w:type="spellEnd"/>
-      <w:r>
-        <w:rPr>
-          <w:rFonts w:ascii="Times New Roman" w:hAnsi="Times New Roman" w:cs="Times New Roman"/>
-        </w:rPr>
-        <w:t>, junto con sus módulos adicionales, para la generación de gráficas y la visualización de resultados.</w:t>
-      </w:r>
-    </w:p>
-    <w:p>
-      <w:pPr>
-        <w:jc w:val="both"/>
-        <w:rPr>
-          <w:rFonts w:ascii="Times New Roman" w:hAnsi="Times New Roman" w:cs="Times New Roman"/>
-        </w:rPr>
-      </w:pPr>
-      <w:r>
-        <w:rPr>
-          <w:rFonts w:ascii="Times New Roman" w:hAnsi="Times New Roman" w:cs="Times New Roman"/>
-        </w:rPr>
-        <w:t>Posteriormente, se definió una clase denominada Proceso, en la cual se almacenan los atributos principales de cada proceso, tales como el nombre, tiempo de llegada y tiempo de CPU. Asimismo, esta clase incluye los valores calculados durante la ejecución de los algoritmos, como el tiempo de inicio, tiempo de finalización, tiempo de retorno y tiempo de espera.</w:t>
-      </w:r>
-    </w:p>
-    <w:p>
-      <w:pPr>
-        <w:jc w:val="both"/>
-        <w:rPr>
-          <w:rFonts w:ascii="Times New Roman" w:hAnsi="Times New Roman" w:cs="Times New Roman"/>
-        </w:rPr>
-      </w:pPr>
-      <w:r>
-        <w:rPr>
-          <w:rFonts w:ascii="Times New Roman" w:hAnsi="Times New Roman" w:cs="Times New Roman"/>
-        </w:rPr>
-        <w:lastRenderedPageBreak/>
-        <w:t>A continuación, se implementó la lectura de datos desde un archivo CSV mediante una función que permite cargar los procesos correspondientes a un caso específico. De manera complementaria, se desarrolló otra función para identificar los casos disponibles dentro del archivo, permitiendo así trabajar con múltiples conjuntos de datos sin necesidad de modificar el código fuente.</w:t>
-      </w:r>
-    </w:p>
-    <w:p>
-      <w:pPr>
-        <w:jc w:val="both"/>
-        <w:rPr>
-          <w:rFonts w:ascii="Times New Roman" w:hAnsi="Times New Roman" w:cs="Times New Roman"/>
-        </w:rPr>
-      </w:pPr>
-      <w:r>
-        <w:rPr>
-          <w:rFonts w:ascii="Times New Roman" w:hAnsi="Times New Roman" w:cs="Times New Roman"/>
-        </w:rPr>
-        <w:t xml:space="preserve">Luego, se implementó el algoritmo de planificación FCFS (First Come First </w:t>
-      </w:r>
-      <w:proofErr w:type="spellStart"/>
-      <w:r>
-        <w:rPr>
-          <w:rFonts w:ascii="Times New Roman" w:hAnsi="Times New Roman" w:cs="Times New Roman"/>
-        </w:rPr>
-        <w:t>Served</w:t>
-      </w:r>
-      <w:proofErr w:type="spellEnd"/>
-      <w:r>
-        <w:rPr>
-          <w:rFonts w:ascii="Times New Roman" w:hAnsi="Times New Roman" w:cs="Times New Roman"/>
-        </w:rPr>
-        <w:t>). Este algoritmo realiza una copia de la lista de procesos y los ordena según su tiempo de llegada. Posteriormente, simula la ejecución en un único procesador mediante una variable de control de tiempo. Si el procesador se encuentra libre antes de la llegada de un proceso, el tiempo avanza hasta el momento en que este llega. Cada proceso se ejecuta completamente en orden, calculando su tiempo de inicio, finalización, tiempo de espera y tiempo de retorno. Finalmente, se devuelve la lista de procesos con todos los valores ya calculados.</w:t>
-      </w:r>
-    </w:p>
-    <w:p>
-      <w:pPr>
-        <w:jc w:val="both"/>
-        <w:rPr>
-          <w:rFonts w:ascii="Times New Roman" w:hAnsi="Times New Roman" w:cs="Times New Roman"/>
-        </w:rPr>
-      </w:pPr>
-      <w:r>
-        <w:rPr>
-          <w:rFonts w:ascii="Times New Roman" w:hAnsi="Times New Roman" w:cs="Times New Roman"/>
-        </w:rPr>
-        <w:t>Seguidamente, se implementó el algoritmo SPN (Shortest Process Next). Este algoritmo también trabaja sobre una copia de los procesos y mantiene una lista de procesos pendientes. La simulación avanza en el tiempo del CPU, evaluando en cada instante qué procesos han llegado. De los procesos disponibles, se selecciona aquel con el menor tiempo de CPU; en caso de empate, se prioriza el proceso que haya llegado primero. Cada proceso seleccionado se ejecuta de manera completa y sin interrupciones, calculándose sus respectivas métricas de rendimiento.</w:t>
-      </w:r>
-    </w:p>
-    <w:p>
-      <w:pPr>
-        <w:jc w:val="both"/>
-        <w:rPr>
-          <w:rFonts w:ascii="Times New Roman" w:hAnsi="Times New Roman" w:cs="Times New Roman"/>
-        </w:rPr>
-      </w:pPr>
-      <w:r>
-        <w:rPr>
-          <w:rFonts w:ascii="Times New Roman" w:hAnsi="Times New Roman" w:cs="Times New Roman"/>
-        </w:rPr>
-        <w:t>Finalmente, se implementaron los módulos correspondientes a la visualización de resultados, incluyendo la representación gráfica mediante diagramas de Gantt y tablas comparativas para ambos algoritmos.</w:t>
-      </w:r>
-    </w:p>
-    <w:p>
-      <w:pPr>
-        <w:pStyle w:val="Ttulo2"/>
-      </w:pPr>
-      <w:r>
-        <w:t>5. Interfaz gráfica</w:t>
-      </w:r>
-    </w:p>
-    <w:p>
-      <w:pPr>
-        <w:jc w:val="both"/>
-        <w:rPr>
-          <w:rFonts w:ascii="Times New Roman" w:hAnsi="Times New Roman" w:cs="Times New Roman"/>
-        </w:rPr>
-      </w:pPr>
-      <w:r>
-        <w:rPr>
-          <w:rFonts w:ascii="Times New Roman" w:hAnsi="Times New Roman" w:cs="Times New Roman"/>
-        </w:rPr>
-        <w:t>La interfaz gráfica permite visualizar la ejecución de los procesos mediante un diagrama de Gantt dinámico, donde cada proceso es representado como un bloque en el eje temporal, facilitando la comprensión del orden de ejecución y su duración.</w:t>
-      </w:r>
-    </w:p>
-    <w:p>
-      <w:pPr>
-        <w:jc w:val="both"/>
-        <w:rPr>
-          <w:rFonts w:ascii="Times New Roman" w:hAnsi="Times New Roman" w:cs="Times New Roman"/>
-        </w:rPr>
-      </w:pPr>
-      <w:r>
-        <w:rPr>
-          <w:rFonts w:ascii="Times New Roman" w:hAnsi="Times New Roman" w:cs="Times New Roman"/>
-        </w:rPr>
-        <w:t>La pantalla se encuentra dividida en dos secciones principales, una correspondiente al algoritmo FCFS y otra al algoritmo SPN, lo que permite realizar una comparación visual directa entre ambos métodos de planificación.</w:t>
-      </w:r>
-    </w:p>
-    <w:p>
-      <w:pPr>
-        <w:jc w:val="both"/>
-        <w:rPr>
-          <w:rFonts w:ascii="Times New Roman" w:hAnsi="Times New Roman" w:cs="Times New Roman"/>
-        </w:rPr>
-      </w:pPr>
-      <w:r>
-        <w:rPr>
-          <w:rFonts w:ascii="Times New Roman" w:hAnsi="Times New Roman" w:cs="Times New Roman"/>
-        </w:rPr>
-        <w:t>Debajo de cada diagrama se muestra una tabla con los valores calculados para cada proceso, incluyendo el tiempo de llegada, tiempo de CPU, tiempo de inicio, tiempo de finalización, tiempo de espera y tiempo de retorno, asegurando una presentación completa de los resultados.</w:t>
-      </w:r>
-    </w:p>
-    <w:p>
-      <w:pPr>
-        <w:jc w:val="both"/>
-        <w:rPr>
-          <w:rFonts w:ascii="Times New Roman" w:hAnsi="Times New Roman" w:cs="Times New Roman"/>
-        </w:rPr>
-      </w:pPr>
-      <w:r>
-        <w:rPr>
-          <w:rFonts w:ascii="Times New Roman" w:hAnsi="Times New Roman" w:cs="Times New Roman"/>
-        </w:rPr>
-        <w:t>En la parte superior de la interfaz se encuentran los casos disponibles, los cuales son cargados desde el archivo CSV, permitiendo seleccionar diferentes conjuntos de datos sin necesidad de modificar el sistema.</w:t>
-      </w:r>
-    </w:p>
-    <w:p>
-      <w:pPr>
-        <w:jc w:val="both"/>
-        <w:rPr>
-          <w:rFonts w:ascii="Times New Roman" w:hAnsi="Times New Roman" w:cs="Times New Roman"/>
-        </w:rPr>
-      </w:pPr>
-      <w:r>
-        <w:rPr>
-          <w:rFonts w:ascii="Times New Roman" w:hAnsi="Times New Roman" w:cs="Times New Roman"/>
-        </w:rPr>
-        <w:t>Adicionalmente, se muestran los promedios de los tiempos de espera y retorno para cada algoritmo, lo que facilita el análisis comparativo de su rendimiento. La visualización se actualiza dinámicamente en función del caso seleccionado, garantizando una interacción fluida y en tiempo real.</w:t>
-      </w:r>
-    </w:p>
-    <w:p>
-      <w:pPr>
-        <w:pStyle w:val="Ttulo2"/>
-      </w:pPr>
-      <w:r>
-        <w:t>6. Entrada de datos</w:t>
-      </w:r>
-    </w:p>
-    <w:p>
-      <w:pPr>
-        <w:jc w:val="both"/>
-        <w:rPr>
-          <w:rFonts w:ascii="Times New Roman" w:hAnsi="Times New Roman" w:cs="Times New Roman"/>
-        </w:rPr>
-      </w:pPr>
-      <w:r>
-        <w:rPr>
-          <w:rFonts w:ascii="Times New Roman" w:hAnsi="Times New Roman" w:cs="Times New Roman"/>
-        </w:rPr>
-        <w:t xml:space="preserve">El sistema carga los procesos desde un archivo CSV denominado </w:t>
-      </w:r>
-      <w:r>
-        <w:rPr>
-          <w:rFonts w:ascii="Times New Roman" w:hAnsi="Times New Roman" w:cs="Times New Roman"/>
-          <w:b/>
-          <w:bCs/>
-        </w:rPr>
-        <w:t>PROCESOS.csv</w:t>
-      </w:r>
-      <w:r>
-        <w:rPr>
-          <w:rFonts w:ascii="Times New Roman" w:hAnsi="Times New Roman" w:cs="Times New Roman"/>
-        </w:rPr>
-        <w:t xml:space="preserve"> mediante la función </w:t>
-      </w:r>
-      <w:proofErr w:type="spellStart"/>
-      <w:r>
-        <w:rPr>
-          <w:rFonts w:ascii="Times New Roman" w:hAnsi="Times New Roman" w:cs="Times New Roman"/>
-        </w:rPr>
-        <w:t>leer_procesos_por_caso</w:t>
-      </w:r>
-      <w:proofErr w:type="spellEnd"/>
-      <w:r>
-        <w:rPr>
-          <w:rFonts w:ascii="Times New Roman" w:hAnsi="Times New Roman" w:cs="Times New Roman"/>
-        </w:rPr>
-        <w:t>. Este archivo contiene los datos organizados en columnas separadas por punto y coma (;), siguiendo la estructura que incluye el caso, el nombre del proceso, el tiempo de llegada y el tiempo de CPU.</w:t>
-      </w:r>
-    </w:p>
-    <w:p>
-      <w:pPr>
-        <w:jc w:val="both"/>
-        <w:rPr>
-          <w:rFonts w:ascii="Times New Roman" w:hAnsi="Times New Roman" w:cs="Times New Roman"/>
-        </w:rPr>
-      </w:pPr>
-      <w:r>
-        <w:rPr>
-          <w:rFonts w:ascii="Times New Roman" w:hAnsi="Times New Roman" w:cs="Times New Roman"/>
-        </w:rPr>
-        <w:t xml:space="preserve">Para la lectura de los datos, el programa utiliza la librería </w:t>
-      </w:r>
-      <w:proofErr w:type="spellStart"/>
-      <w:r>
-        <w:rPr>
-          <w:rFonts w:ascii="Times New Roman" w:hAnsi="Times New Roman" w:cs="Times New Roman"/>
-          <w:b/>
-          <w:bCs/>
-        </w:rPr>
-        <w:t>csv</w:t>
-      </w:r>
-      <w:proofErr w:type="spellEnd"/>
-      <w:r>
-        <w:rPr>
-          <w:rFonts w:ascii="Times New Roman" w:hAnsi="Times New Roman" w:cs="Times New Roman"/>
-        </w:rPr>
-        <w:t xml:space="preserve"> junto con </w:t>
-      </w:r>
-      <w:proofErr w:type="spellStart"/>
-      <w:r>
-        <w:rPr>
-          <w:rFonts w:ascii="Times New Roman" w:hAnsi="Times New Roman" w:cs="Times New Roman"/>
-        </w:rPr>
-        <w:t>DictReader</w:t>
-      </w:r>
-      <w:proofErr w:type="spellEnd"/>
-      <w:r>
-        <w:rPr>
-          <w:rFonts w:ascii="Times New Roman" w:hAnsi="Times New Roman" w:cs="Times New Roman"/>
-        </w:rPr>
-        <w:t xml:space="preserve">, lo que permite interpretar cada fila del archivo como un diccionario. De esta manera, el sistema recorre el archivo completo y filtra únicamente los procesos que pertenecen al caso seleccionado desde la interfaz </w:t>
-      </w:r>
-      <w:proofErr w:type="spellStart"/>
-      <w:r>
-        <w:rPr>
-          <w:rFonts w:ascii="Times New Roman" w:hAnsi="Times New Roman" w:cs="Times New Roman"/>
-        </w:rPr>
-        <w:t>gráfica.Una</w:t>
-      </w:r>
-      <w:proofErr w:type="spellEnd"/>
-      <w:r>
-        <w:rPr>
-          <w:rFonts w:ascii="Times New Roman" w:hAnsi="Times New Roman" w:cs="Times New Roman"/>
-        </w:rPr>
-        <w:t xml:space="preserve"> vez filtrados, los valores de llegada y CPU son convertidos a tipo entero, y posteriormente se crean objetos de la clase </w:t>
-      </w:r>
-      <w:r>
-        <w:rPr>
-          <w:rFonts w:ascii="Times New Roman" w:hAnsi="Times New Roman" w:cs="Times New Roman"/>
-          <w:b/>
-          <w:bCs/>
-        </w:rPr>
-        <w:t>Proceso</w:t>
-      </w:r>
-      <w:r>
-        <w:rPr>
-          <w:rFonts w:ascii="Times New Roman" w:hAnsi="Times New Roman" w:cs="Times New Roman"/>
-        </w:rPr>
-        <w:t>, los cuales son almacenados en una lista para su posterior procesamiento por los algoritmos de planificación.</w:t>
-      </w:r>
-    </w:p>
-    <w:p>
-      <w:pPr>
-        <w:jc w:val="both"/>
-        <w:rPr>
-          <w:rFonts w:ascii="Times New Roman" w:hAnsi="Times New Roman" w:cs="Times New Roman"/>
-        </w:rPr>
-      </w:pPr>
-      <w:r>
-        <w:rPr>
-          <w:rFonts w:ascii="Times New Roman" w:hAnsi="Times New Roman" w:cs="Times New Roman"/>
-        </w:rPr>
-        <w:lastRenderedPageBreak/>
-        <w:t xml:space="preserve">El sistema incorpora una validación básica para evitar la duplicación de procesos. Esto se logra mediante el uso de un conjunto (set) denominado </w:t>
-      </w:r>
-      <w:r>
-        <w:rPr>
-          <w:rFonts w:ascii="Times New Roman" w:hAnsi="Times New Roman" w:cs="Times New Roman"/>
-          <w:i/>
-          <w:iCs/>
-        </w:rPr>
-        <w:t>vistos</w:t>
-      </w:r>
-      <w:r>
-        <w:rPr>
-          <w:rFonts w:ascii="Times New Roman" w:hAnsi="Times New Roman" w:cs="Times New Roman"/>
-        </w:rPr>
-        <w:t>, el cual almacena combinaciones únicas compuestas por el nombre del proceso, el tiempo de llegada y el tiempo de CPU. Si un proceso ya ha sido leído previamente, no se vuelve a agregar a la lista, garantizando la integridad de los datos.</w:t>
-      </w:r>
-    </w:p>
-    <w:p>
-      <w:pPr>
-        <w:jc w:val="both"/>
-        <w:rPr>
-          <w:rFonts w:ascii="Times New Roman" w:hAnsi="Times New Roman" w:cs="Times New Roman"/>
-        </w:rPr>
-      </w:pPr>
-      <w:r>
-        <w:rPr>
-          <w:rFonts w:ascii="Times New Roman" w:hAnsi="Times New Roman" w:cs="Times New Roman"/>
-        </w:rPr>
-        <w:t xml:space="preserve">Asimismo, el sistema está diseñado para soportar múltiples escenarios dentro de un mismo archivo CSV. Cada proceso está asociado a un campo denominado </w:t>
-      </w:r>
-      <w:r>
-        <w:rPr>
-          <w:rFonts w:ascii="Times New Roman" w:hAnsi="Times New Roman" w:cs="Times New Roman"/>
-          <w:b/>
-          <w:bCs/>
-        </w:rPr>
-        <w:t>CASO</w:t>
-      </w:r>
-      <w:r>
-        <w:rPr>
-          <w:rFonts w:ascii="Times New Roman" w:hAnsi="Times New Roman" w:cs="Times New Roman"/>
-        </w:rPr>
-        <w:t>, lo que permite trabajar con diferentes conjuntos de datos sin necesidad de modificar el código. Esto facilita la selección de distintos casos desde la interfaz gráfica, la comparación de escenarios de planificación y la ejecución de los algoritmos FCFS y SPN sobre un mismo conjunto seleccionado.</w:t>
-      </w:r>
-    </w:p>
-    <w:p>
-      <w:pPr>
-        <w:jc w:val="both"/>
-        <w:rPr>
-          <w:rFonts w:ascii="Times New Roman" w:hAnsi="Times New Roman" w:cs="Times New Roman"/>
-        </w:rPr>
-      </w:pPr>
-      <w:r>
-        <w:rPr>
-          <w:rFonts w:ascii="Times New Roman" w:hAnsi="Times New Roman" w:cs="Times New Roman"/>
-        </w:rPr>
-        <w:t xml:space="preserve">Finalmente, la función </w:t>
-      </w:r>
-      <w:proofErr w:type="spellStart"/>
-      <w:r>
-        <w:rPr>
-          <w:rFonts w:ascii="Times New Roman" w:hAnsi="Times New Roman" w:cs="Times New Roman"/>
-        </w:rPr>
-        <w:t>obtener_casos_disponibles</w:t>
-      </w:r>
-      <w:proofErr w:type="spellEnd"/>
-      <w:r>
-        <w:rPr>
-          <w:rFonts w:ascii="Times New Roman" w:hAnsi="Times New Roman" w:cs="Times New Roman"/>
-        </w:rPr>
-        <w:t xml:space="preserve"> se encarga de extraer automáticamente todos los casos únicos presentes en el archivo CSV, los cuales son mostrados como opciones en la interfaz gráfica para su selección.</w:t>
-      </w:r>
-    </w:p>
-    <w:p>
-      <w:pPr>
-        <w:pStyle w:val="Ttulo2"/>
-      </w:pPr>
-      <w:r>
-        <w:t>7. Cálculo de métricas</w:t>
-      </w:r>
-    </w:p>
-    <w:p>
-      <w:r>
-        <w:t>El sistema de planificación de procesos calcula métricas fundamentales para evaluar el rendimiento de los algoritmos FCFS y SPN, a partir de los tiempos de llegada, inicio, finalización y tiempo de CPU de cada proceso.</w:t>
-      </w:r>
-    </w:p>
-    <w:p>
-      <w:r>
-        <w:t>Tiempo de retorno</w:t>
-      </w:r>
-    </w:p>
-    <w:p>
-      <w:r>
-        <w:t>Fórmula:</w:t>
-      </w:r>
-    </w:p>
-    <w:p>
-      <w:r>
-        <w:t>Tiempo de retorno = Fin − Llegada</w:t>
-      </w:r>
-    </w:p>
-    <w:p>
-      <w:pPr>
-        <w:rPr>
-          <w:b/>
-          <w:bCs/>
-        </w:rPr>
-      </w:pPr>
-      <w:r>
-        <w:rPr>
-          <w:b/>
-          <w:bCs/>
-        </w:rPr>
-        <w:t>En el código:</w:t>
-      </w:r>
-    </w:p>
-    <w:p>
-      <w:proofErr w:type="spellStart"/>
-      <w:r>
-        <w:t>p.retorno</w:t>
-      </w:r>
-      <w:proofErr w:type="spellEnd"/>
-      <w:r>
-        <w:t xml:space="preserve"> = </w:t>
-      </w:r>
-      <w:proofErr w:type="spellStart"/>
-      <w:r>
-        <w:t>p.fin</w:t>
-      </w:r>
-      <w:proofErr w:type="spellEnd"/>
-      <w:r>
-        <w:t xml:space="preserve"> - </w:t>
-      </w:r>
-      <w:proofErr w:type="spellStart"/>
-      <w:r>
-        <w:t>p.llegada</w:t>
-      </w:r>
-      <w:proofErr w:type="spellEnd"/>
-    </w:p>
-    <w:p>
-      <w:r>
-        <w:t>Descripción:</w:t>
-      </w:r>
-    </w:p>
-    <w:p>
-      <w:r>
-        <w:t>El tiempo de retorno representa el tiempo total que un proceso permanece en el sistema, desde su llegada hasta su finalización. Incluye tanto el tiempo de ejecución como el tiempo de espera en cola.</w:t>
-      </w:r>
-    </w:p>
-    <w:p>
-      <w:r>
-        <w:t>Tiempo de espera</w:t>
-      </w:r>
-    </w:p>
-    <w:p>
-      <w:r>
-        <w:t>Fórmula:</w:t>
-      </w:r>
-    </w:p>
-    <w:p>
-      <w:r>
-        <w:t>Tiempo de espera = Inicio − Llegada</w:t>
-      </w:r>
-    </w:p>
-    <w:p>
-      <w:r>
-        <w:t>En el código:</w:t>
-      </w:r>
-    </w:p>
-    <w:p>
-      <w:proofErr w:type="spellStart"/>
-      <w:r>
-        <w:t>p.espera</w:t>
-      </w:r>
-      <w:proofErr w:type="spellEnd"/>
-      <w:r>
-        <w:t xml:space="preserve"> = </w:t>
-      </w:r>
-      <w:proofErr w:type="spellStart"/>
-      <w:r>
-        <w:t>p.inicio</w:t>
-      </w:r>
-      <w:proofErr w:type="spellEnd"/>
-      <w:r>
-        <w:t xml:space="preserve"> - </w:t>
-      </w:r>
-      <w:proofErr w:type="spellStart"/>
-      <w:r>
-        <w:t>p.llegada</w:t>
-      </w:r>
-      <w:proofErr w:type="spellEnd"/>
-    </w:p>
-    <w:p/>
-    <w:p>
-      <w:pPr>
-        <w:rPr>
-          <w:b/>
-          <w:bCs/>
-        </w:rPr>
-      </w:pPr>
-      <w:r>
-        <w:rPr>
-          <w:b/>
-          <w:bCs/>
-        </w:rPr>
-        <w:t>Descripción:</w:t>
-      </w:r>
-    </w:p>
-    <w:p>
-      <w:r>
-        <w:t>El tiempo de espera indica el tiempo que un proceso permanece en cola antes de iniciar su ejecución. Refleja el tiempo que el proceso debe esperar hasta ser atendido por el CPU.</w:t>
-      </w:r>
-    </w:p>
-    <w:p>
-      <w:r>
-        <w:t>Ejemplo de cálculo</w:t>
-      </w:r>
-    </w:p>
-    <w:p>
-      <w:r>
-        <w:t>Para cada proceso, el sistema realiza los siguientes pasos:</w:t>
-      </w:r>
-    </w:p>
-    <w:p>
-      <w:r>
-        <w:t>Determina el tiempo de inicio de ejecución.</w:t>
-      </w:r>
-    </w:p>
-    <w:p>
-      <w:r>
-        <w:t>Calcula el tiempo de finalización.</w:t>
-      </w:r>
-    </w:p>
-    <w:p>
-      <w:r>
-        <w:t>A partir de estos valores obtiene:</w:t>
+        <w:t xml:space="preserve">Tiempo de retorno: diferencia entre el tiempo de finalización y el tiempo de llegada del proceso. </w:t>
       </w:r>
     </w:p>
     <w:p>
@@ -4712,12 +4870,60 @@
         <w:pStyle w:val="Prrafodelista"/>
         <w:numPr>
           <w:ilvl w:val="0"/>
-          <w:numId w:val="1"/>
+          <w:numId w:val="9"/>
         </w:numPr>
-      </w:pPr>
-      <w:r>
-        <w:lastRenderedPageBreak/>
-        <w:t>Tiempo de retorno</w:t>
+        <w:jc w:val="both"/>
+        <w:rPr>
+          <w:rFonts w:ascii="Times New Roman" w:hAnsi="Times New Roman" w:cs="Times New Roman"/>
+        </w:rPr>
+      </w:pPr>
+      <w:r>
+        <w:rPr>
+          <w:rFonts w:ascii="Times New Roman" w:hAnsi="Times New Roman" w:cs="Times New Roman"/>
+        </w:rPr>
+        <w:t xml:space="preserve">Tiempo de espera: tiempo que el proceso permanece en cola sin ejecutarse, calculado a partir del tiempo de retorno menos el tiempo de ejecución. </w:t>
+      </w:r>
+    </w:p>
+    <w:p>
+      <w:pPr>
+        <w:jc w:val="both"/>
+        <w:rPr>
+          <w:rFonts w:ascii="Times New Roman" w:hAnsi="Times New Roman" w:cs="Times New Roman"/>
+        </w:rPr>
+      </w:pPr>
+      <w:r>
+        <w:rPr>
+          <w:rFonts w:ascii="Times New Roman" w:hAnsi="Times New Roman" w:cs="Times New Roman"/>
+        </w:rPr>
+        <w:t>A partir de estos valores individuales, el sistema también calcula métricas globales como los promedios generales de tiempo de espera y tiempo de retorno, los cuales permiten evaluar el desempeño del algoritmo en su conjunto.</w:t>
+      </w:r>
+    </w:p>
+    <w:p>
+      <w:pPr>
+        <w:jc w:val="both"/>
+        <w:rPr>
+          <w:rFonts w:ascii="Times New Roman" w:hAnsi="Times New Roman" w:cs="Times New Roman"/>
+        </w:rPr>
+      </w:pPr>
+      <w:r>
+        <w:rPr>
+          <w:rFonts w:ascii="Times New Roman" w:hAnsi="Times New Roman" w:cs="Times New Roman"/>
+        </w:rPr>
+        <w:t>En el caso de algoritmos como FCFS y SPN, estos cálculos se realizan una vez que se determina el orden completo de ejecución. Para algoritmos expulsivos como SRT y Round Robin, las métricas se obtienen considerando la evolución del proceso a lo largo del tiempo, ya que un mismo proceso puede ser interrumpido y reanudado varias veces.</w:t>
+      </w:r>
+    </w:p>
+    <w:p>
+      <w:pPr>
+        <w:jc w:val="both"/>
+        <w:rPr>
+          <w:rFonts w:ascii="Times New Roman" w:hAnsi="Times New Roman" w:cs="Times New Roman"/>
+        </w:rPr>
+      </w:pPr>
+      <w:r>
+        <w:rPr>
+          <w:rFonts w:ascii="Times New Roman" w:hAnsi="Times New Roman" w:cs="Times New Roman"/>
+        </w:rPr>
+        <w:t>Por otro lado, en la gestión de memoria también se calculan métricas importantes como:</w:t>
       </w:r>
     </w:p>
     <w:p>
@@ -4725,11 +4931,18 @@
         <w:pStyle w:val="Prrafodelista"/>
         <w:numPr>
           <w:ilvl w:val="0"/>
-          <w:numId w:val="1"/>
+          <w:numId w:val="10"/>
         </w:numPr>
-      </w:pPr>
-      <w:r>
-        <w:t>Tiempo de espera</w:t>
+        <w:jc w:val="both"/>
+        <w:rPr>
+          <w:rFonts w:ascii="Times New Roman" w:hAnsi="Times New Roman" w:cs="Times New Roman"/>
+        </w:rPr>
+      </w:pPr>
+      <w:r>
+        <w:rPr>
+          <w:rFonts w:ascii="Times New Roman" w:hAnsi="Times New Roman" w:cs="Times New Roman"/>
+        </w:rPr>
+        <w:t xml:space="preserve">Memoria total utilizada: suma del tamaño de los procesos asignados. </w:t>
       </w:r>
     </w:p>
     <w:p>
@@ -4737,16 +4950,18 @@
         <w:pStyle w:val="Prrafodelista"/>
         <w:numPr>
           <w:ilvl w:val="0"/>
-          <w:numId w:val="1"/>
+          <w:numId w:val="10"/>
         </w:numPr>
-      </w:pPr>
-      <w:r>
-        <w:t>Promedios generales</w:t>
-      </w:r>
-    </w:p>
-    <w:p>
-      <w:r>
-        <w:t>Además de los valores individuales, el sistema calcula métricas promedio para cada algoritmo:</w:t>
+        <w:jc w:val="both"/>
+        <w:rPr>
+          <w:rFonts w:ascii="Times New Roman" w:hAnsi="Times New Roman" w:cs="Times New Roman"/>
+        </w:rPr>
+      </w:pPr>
+      <w:r>
+        <w:rPr>
+          <w:rFonts w:ascii="Times New Roman" w:hAnsi="Times New Roman" w:cs="Times New Roman"/>
+        </w:rPr>
+        <w:t xml:space="preserve">Memoria libre: espacio restante después de las asignaciones. </w:t>
       </w:r>
     </w:p>
     <w:p>
@@ -4754,11 +4969,18 @@
         <w:pStyle w:val="Prrafodelista"/>
         <w:numPr>
           <w:ilvl w:val="0"/>
-          <w:numId w:val="2"/>
+          <w:numId w:val="10"/>
         </w:numPr>
-      </w:pPr>
-      <w:r>
-        <w:t>Promedio del tiempo de retorno</w:t>
+        <w:jc w:val="both"/>
+        <w:rPr>
+          <w:rFonts w:ascii="Times New Roman" w:hAnsi="Times New Roman" w:cs="Times New Roman"/>
+        </w:rPr>
+      </w:pPr>
+      <w:r>
+        <w:rPr>
+          <w:rFonts w:ascii="Times New Roman" w:hAnsi="Times New Roman" w:cs="Times New Roman"/>
+        </w:rPr>
+        <w:t xml:space="preserve">Fragmentación interna (en particiones fijas): diferencia entre el tamaño de la partición asignada y el tamaño real del proceso. </w:t>
       </w:r>
     </w:p>
     <w:p>
@@ -4766,16 +4988,47 @@
         <w:pStyle w:val="Prrafodelista"/>
         <w:numPr>
           <w:ilvl w:val="0"/>
-          <w:numId w:val="2"/>
+          <w:numId w:val="10"/>
         </w:numPr>
-      </w:pPr>
-      <w:r>
-        <w:t>Promedio del tiempo de espera</w:t>
-      </w:r>
-    </w:p>
-    <w:p>
-      <w:r>
-        <w:t>Estos indicadores permiten evaluar el rendimiento global de los algoritmos FCFS y SPN, facilitando la comparación de su eficiencia en distintos escenarios de planificación.</w:t>
+        <w:jc w:val="both"/>
+        <w:rPr>
+          <w:rFonts w:ascii="Times New Roman" w:hAnsi="Times New Roman" w:cs="Times New Roman"/>
+        </w:rPr>
+      </w:pPr>
+      <w:r>
+        <w:rPr>
+          <w:rFonts w:ascii="Times New Roman" w:hAnsi="Times New Roman" w:cs="Times New Roman"/>
+        </w:rPr>
+        <w:t xml:space="preserve">Cantidad de procesos asignados y rechazados: permite evaluar la eficiencia del algoritmo de asignación. </w:t>
+      </w:r>
+    </w:p>
+    <w:p>
+      <w:pPr>
+        <w:jc w:val="both"/>
+        <w:rPr>
+          <w:rFonts w:ascii="Times New Roman" w:hAnsi="Times New Roman" w:cs="Times New Roman"/>
+        </w:rPr>
+      </w:pPr>
+      <w:r>
+        <w:rPr>
+          <w:rFonts w:ascii="Times New Roman" w:hAnsi="Times New Roman" w:cs="Times New Roman"/>
+        </w:rPr>
+        <w:lastRenderedPageBreak/>
+        <w:t>Estas métricas son actualizadas dinámicamente después de cada simulación, lo que permite al usuario observar cómo cambian los resultados dependiendo del algoritmo seleccionado.</w:t>
+      </w:r>
+    </w:p>
+    <w:p>
+      <w:pPr>
+        <w:jc w:val="both"/>
+        <w:rPr>
+          <w:rFonts w:ascii="Times New Roman" w:hAnsi="Times New Roman" w:cs="Times New Roman"/>
+        </w:rPr>
+      </w:pPr>
+      <w:r>
+        <w:rPr>
+          <w:rFonts w:ascii="Times New Roman" w:hAnsi="Times New Roman" w:cs="Times New Roman"/>
+        </w:rPr>
+        <w:t>Finalmente, el cálculo de estas métricas permite no solo visualizar la ejecución de los procesos, sino también realizar un análisis comparativo entre algoritmos, facilitando la comprensión del impacto que tiene cada estrategia en el uso de CPU y memoria del sistema.</w:t>
       </w:r>
     </w:p>
     <w:p>
@@ -4797,21 +5050,119 @@
         <w:rPr>
           <w:rFonts w:ascii="Times New Roman" w:hAnsi="Times New Roman" w:cs="Times New Roman"/>
         </w:rPr>
-        <w:t xml:space="preserve">A partir de las simulaciones realizadas con los algoritmos FCFS (First Come First </w:t>
+        <w:t>En general, los resultados obtenidos a partir del simulador permiten observar de manera clara el comportamiento de los distintos algoritmos implementados, tanto en planificación de procesos como en gestión de memoria. Gracias a la representación gráfica, las tablas de resultados y el procesamiento del código, se puede realizar un análisis completo del uso de los recursos del sistema.</w:t>
+      </w:r>
+    </w:p>
+    <w:p>
+      <w:pPr>
+        <w:jc w:val="both"/>
+        <w:rPr>
+          <w:rFonts w:ascii="Times New Roman" w:hAnsi="Times New Roman" w:cs="Times New Roman"/>
+        </w:rPr>
+      </w:pPr>
+      <w:r>
+        <w:rPr>
+          <w:rFonts w:ascii="Times New Roman" w:hAnsi="Times New Roman" w:cs="Times New Roman"/>
+        </w:rPr>
+        <w:t xml:space="preserve">En la parte de planificación de procesos, los diagramas de Gantt permiten visualizar de forma directa el orden de ejecución de los procesos. En algoritmos como FCFS, se observa una ejecución secuencial según el orden de llegada, lo que en algunos casos puede generar tiempos de espera elevados para procesos que llegan más </w:t>
+      </w:r>
+      <w:proofErr w:type="gramStart"/>
+      <w:r>
+        <w:rPr>
+          <w:rFonts w:ascii="Times New Roman" w:hAnsi="Times New Roman" w:cs="Times New Roman"/>
+        </w:rPr>
+        <w:t>tarde</w:t>
+      </w:r>
+      <w:proofErr w:type="gramEnd"/>
+      <w:r>
+        <w:rPr>
+          <w:rFonts w:ascii="Times New Roman" w:hAnsi="Times New Roman" w:cs="Times New Roman"/>
+        </w:rPr>
+        <w:t xml:space="preserve"> pero tienen menor duración. En cambio, con SPN, se evidencia una mejor optimización del tiempo promedio de espera, ya que los procesos más cortos son ejecutados primero cuando están disponibles.</w:t>
+      </w:r>
+    </w:p>
+    <w:p>
+      <w:pPr>
+        <w:jc w:val="both"/>
+        <w:rPr>
+          <w:rFonts w:ascii="Times New Roman" w:hAnsi="Times New Roman" w:cs="Times New Roman"/>
+        </w:rPr>
+      </w:pPr>
+      <w:r>
+        <w:rPr>
+          <w:rFonts w:ascii="Times New Roman" w:hAnsi="Times New Roman" w:cs="Times New Roman"/>
+        </w:rPr>
+        <w:t>Por otro lado, en algoritmos expulsivos como SRT, el comportamiento es más dinámico, ya que los procesos pueden ser interrumpidos si llega uno con menor tiempo restante. Esto se refleja en el diagrama de Gantt con múltiples fragmentaciones en la ejecución de los procesos. En el caso de Round Robin, la ejecución se distribuye de manera equitativa mediante el uso de quantum, lo que mejora la justicia entre procesos, aunque puede incrementar el número de cambios de contexto.</w:t>
+      </w:r>
+    </w:p>
+    <w:p>
+      <w:pPr>
+        <w:jc w:val="both"/>
+        <w:rPr>
+          <w:rFonts w:ascii="Times New Roman" w:hAnsi="Times New Roman" w:cs="Times New Roman"/>
+        </w:rPr>
+      </w:pPr>
+      <w:r>
+        <w:rPr>
+          <w:rFonts w:ascii="Times New Roman" w:hAnsi="Times New Roman" w:cs="Times New Roman"/>
+        </w:rPr>
+        <w:t xml:space="preserve">En cuanto a la gestión de memoria, el análisis visual permite comprender cómo los procesos son asignados a diferentes bloques según el algoritmo seleccionado. Con First </w:t>
       </w:r>
       <w:proofErr w:type="spellStart"/>
       <w:r>
         <w:rPr>
           <w:rFonts w:ascii="Times New Roman" w:hAnsi="Times New Roman" w:cs="Times New Roman"/>
         </w:rPr>
-        <w:t>Served</w:t>
+        <w:t>Fit</w:t>
       </w:r>
       <w:proofErr w:type="spellEnd"/>
       <w:r>
         <w:rPr>
           <w:rFonts w:ascii="Times New Roman" w:hAnsi="Times New Roman" w:cs="Times New Roman"/>
         </w:rPr>
-        <w:t>) y SPN (Shortest Process Next), se observaron diferencias significativas en el comportamiento de la planificación de procesos, especialmente en los tiempos de espera y de retorno.</w:t>
+        <w:t xml:space="preserve">, se observa una asignación </w:t>
+      </w:r>
+      <w:proofErr w:type="gramStart"/>
+      <w:r>
+        <w:rPr>
+          <w:rFonts w:ascii="Times New Roman" w:hAnsi="Times New Roman" w:cs="Times New Roman"/>
+        </w:rPr>
+        <w:t>rápida</w:t>
+      </w:r>
+      <w:proofErr w:type="gramEnd"/>
+      <w:r>
+        <w:rPr>
+          <w:rFonts w:ascii="Times New Roman" w:hAnsi="Times New Roman" w:cs="Times New Roman"/>
+        </w:rPr>
+        <w:t xml:space="preserve"> pero con posible fragmentación a largo plazo. Best </w:t>
+      </w:r>
+      <w:proofErr w:type="spellStart"/>
+      <w:r>
+        <w:rPr>
+          <w:rFonts w:ascii="Times New Roman" w:hAnsi="Times New Roman" w:cs="Times New Roman"/>
+        </w:rPr>
+        <w:t>Fit</w:t>
+      </w:r>
+      <w:proofErr w:type="spellEnd"/>
+      <w:r>
+        <w:rPr>
+          <w:rFonts w:ascii="Times New Roman" w:hAnsi="Times New Roman" w:cs="Times New Roman"/>
+        </w:rPr>
+        <w:t xml:space="preserve"> muestra un uso más eficiente del espacio disponible, aunque requiere mayor procesamiento al buscar el bloque más adecuado. En cambio, Worst </w:t>
+      </w:r>
+      <w:proofErr w:type="spellStart"/>
+      <w:r>
+        <w:rPr>
+          <w:rFonts w:ascii="Times New Roman" w:hAnsi="Times New Roman" w:cs="Times New Roman"/>
+        </w:rPr>
+        <w:t>Fit</w:t>
+      </w:r>
+      <w:proofErr w:type="spellEnd"/>
+      <w:r>
+        <w:rPr>
+          <w:rFonts w:ascii="Times New Roman" w:hAnsi="Times New Roman" w:cs="Times New Roman"/>
+        </w:rPr>
+        <w:t xml:space="preserve"> tiende a dejar grandes espacios libres, pero puede desperdiciar memoria útil dependiendo del patrón de entrada.</w:t>
       </w:r>
     </w:p>
     <w:p>
@@ -4825,7 +5176,7 @@
         <w:rPr>
           <w:rFonts w:ascii="Times New Roman" w:hAnsi="Times New Roman" w:cs="Times New Roman"/>
         </w:rPr>
-        <w:t>En el algoritmo FCFS, los procesos se ejecutan estrictamente en el orden de llegada, lo que genera un comportamiento predecible y sencillo. Sin embargo, este enfoque puede producir tiempos de espera elevados, especialmente cuando un proceso con alto tiempo de CPU se ejecuta antes que otros más cortos, afectando el rendimiento general del sistema.</w:t>
+        <w:t>La diferencia entre particiones fijas y memoria dinámica también es un punto importante en el análisis. En particiones fijas, se observa la aparición de fragmentación interna, ya que los procesos no siempre utilizan completamente el espacio asignado. En memoria dinámica, en cambio, el comportamiento es más flexible, pero puede generar fragmentación externa dependiendo de cómo se vayan liberando los bloques.</w:t>
       </w:r>
     </w:p>
     <w:p>
@@ -4839,7 +5190,7 @@
         <w:rPr>
           <w:rFonts w:ascii="Times New Roman" w:hAnsi="Times New Roman" w:cs="Times New Roman"/>
         </w:rPr>
-        <w:t>Por otro lado, el algoritmo SPN mostró una mejor optimización en la mayoría de los casos, ya que prioriza los procesos con menor tiempo de CPU entre los disponibles. Esto permitió reducir el tiempo promedio de espera y, en muchos escenarios, también el tiempo de retorno. No obstante, este algoritmo puede generar desventajas en procesos largos, ya que podrían retrasarse si continúan llegando procesos más cortos.</w:t>
+        <w:t>Desde el punto de vista del código implementado, el sistema permite observar claramente cómo cada algoritmo sigue una lógica distinta en la manipulación de los datos. Las estructuras utilizadas para almacenar procesos, colas de ejecución y bloques de memoria permiten simular el comportamiento real de un sistema operativo de manera simplificada pero funcional. Además, el uso de CSV como entrada facilita la prueba de distintos escenarios sin modificar el código fuente.</w:t>
       </w:r>
     </w:p>
     <w:p>
@@ -4853,7 +5204,7 @@
         <w:rPr>
           <w:rFonts w:ascii="Times New Roman" w:hAnsi="Times New Roman" w:cs="Times New Roman"/>
         </w:rPr>
-        <w:t>En la comparación general, se evidenció que SPN tiende a ser más eficiente en términos de rendimiento promedio, mientras que FCFS destaca por su simplicidad y equidad en el orden de ejecución. La interfaz gráfica permitió visualizar claramente estas diferencias mediante los diagramas de Gantt y las tablas de resultados, facilitando el análisis comparativo entre ambos algoritmos.</w:t>
+        <w:t>Finalmente, la representación gráfica mediante tablas, diagramas de Gantt y visualización de memoria hace que el sistema no solo sea una herramienta de cálculo, sino también una herramienta educativa. Esto permite comprender de forma más intuitiva cómo las decisiones algorítmicas afectan directamente el rendimiento del sistema, tanto en CPU como en memoria, evidenciando la importancia de elegir adecuadamente cada política según el contexto de uso.</w:t>
       </w:r>
     </w:p>
     <w:p>
@@ -4875,21 +5226,70 @@
         <w:rPr>
           <w:rFonts w:ascii="Times New Roman" w:hAnsi="Times New Roman" w:cs="Times New Roman"/>
         </w:rPr>
-        <w:t xml:space="preserve">La implementación del sistema de planificación de procesos permitió comprender de manera práctica el funcionamiento de los algoritmos FCFS (First Come First </w:t>
+        <w:t xml:space="preserve">En conclusión, el desarrollo de este simulador permitió comprender de manera práctica el funcionamiento de los principales algoritmos de planificación de procesos y gestión de memoria utilizados en los sistemas operativos. A través de la implementación de FCFS, SPN, SRT y Round Robin, </w:t>
+      </w:r>
+      <w:r>
+        <w:rPr>
+          <w:rFonts w:ascii="Times New Roman" w:hAnsi="Times New Roman" w:cs="Times New Roman"/>
+        </w:rPr>
+        <w:lastRenderedPageBreak/>
+        <w:t>fue posible analizar cómo cambia el orden de ejecución de los procesos y cómo cada algoritmo afecta directamente a los tiempos de espera, ejecución y respuesta del sistema.</w:t>
+      </w:r>
+    </w:p>
+    <w:p>
+      <w:pPr>
+        <w:jc w:val="both"/>
+        <w:rPr>
+          <w:rFonts w:ascii="Times New Roman" w:hAnsi="Times New Roman" w:cs="Times New Roman"/>
+        </w:rPr>
+      </w:pPr>
+      <w:r>
+        <w:rPr>
+          <w:rFonts w:ascii="Times New Roman" w:hAnsi="Times New Roman" w:cs="Times New Roman"/>
+        </w:rPr>
+        <w:t xml:space="preserve">De igual forma, en la parte de gestión de memoria, la implementación de First </w:t>
       </w:r>
       <w:proofErr w:type="spellStart"/>
       <w:r>
         <w:rPr>
           <w:rFonts w:ascii="Times New Roman" w:hAnsi="Times New Roman" w:cs="Times New Roman"/>
         </w:rPr>
-        <w:t>Served</w:t>
+        <w:t>Fit</w:t>
       </w:r>
       <w:proofErr w:type="spellEnd"/>
       <w:r>
         <w:rPr>
           <w:rFonts w:ascii="Times New Roman" w:hAnsi="Times New Roman" w:cs="Times New Roman"/>
         </w:rPr>
-        <w:t>) y SPN (Shortest Process Next), así como su impacto en el rendimiento del CPU en distintos escenarios.</w:t>
+        <w:t xml:space="preserve">, Best </w:t>
+      </w:r>
+      <w:proofErr w:type="spellStart"/>
+      <w:r>
+        <w:rPr>
+          <w:rFonts w:ascii="Times New Roman" w:hAnsi="Times New Roman" w:cs="Times New Roman"/>
+        </w:rPr>
+        <w:t>Fit</w:t>
+      </w:r>
+      <w:proofErr w:type="spellEnd"/>
+      <w:r>
+        <w:rPr>
+          <w:rFonts w:ascii="Times New Roman" w:hAnsi="Times New Roman" w:cs="Times New Roman"/>
+        </w:rPr>
+        <w:t xml:space="preserve"> y Worst </w:t>
+      </w:r>
+      <w:proofErr w:type="spellStart"/>
+      <w:r>
+        <w:rPr>
+          <w:rFonts w:ascii="Times New Roman" w:hAnsi="Times New Roman" w:cs="Times New Roman"/>
+        </w:rPr>
+        <w:t>Fit</w:t>
+      </w:r>
+      <w:proofErr w:type="spellEnd"/>
+      <w:r>
+        <w:rPr>
+          <w:rFonts w:ascii="Times New Roman" w:hAnsi="Times New Roman" w:cs="Times New Roman"/>
+        </w:rPr>
+        <w:t xml:space="preserve"> permitió observar diferentes estrategias de asignación de espacio, evidenciando ventajas y desventajas en cada caso, especialmente en relación con la fragmentación y el aprovechamiento de la memoria disponible.</w:t>
       </w:r>
     </w:p>
     <w:p>
@@ -4903,7 +5303,7 @@
         <w:rPr>
           <w:rFonts w:ascii="Times New Roman" w:hAnsi="Times New Roman" w:cs="Times New Roman"/>
         </w:rPr>
-        <w:t>Se concluye que el algoritmo FCFS es sencillo de implementar y garantiza un orden justo de ejecución según el tiempo de llegada de los procesos. Sin embargo, su principal desventaja es que puede generar tiempos de espera elevados, especialmente cuando existen procesos con tiempos de CPU largos al inicio de la cola.</w:t>
+        <w:t>El uso de visualizaciones como diagramas de Gantt, tablas de resultados y representación de particiones de memoria facilitó la comprensión del comportamiento interno del sistema. Esto hizo posible interpretar de manera más clara lo que ocurre dentro del sistema operativo cuando se ejecutan múltiples procesos en paralelo y compiten por recursos limitados.</w:t>
       </w:r>
     </w:p>
     <w:p>
@@ -4917,7 +5317,7 @@
         <w:rPr>
           <w:rFonts w:ascii="Times New Roman" w:hAnsi="Times New Roman" w:cs="Times New Roman"/>
         </w:rPr>
-        <w:t>Por otro lado, el algoritmo SPN demostró un mejor rendimiento en términos de eficiencia promedio, ya que reduce los tiempos de espera y retorno al priorizar los procesos con menor duración de CPU. No obstante, este enfoque puede afectar a los procesos más largos, generando posibles retrasos si continúan llegando procesos cortos.</w:t>
+        <w:t>Además, el desarrollo del sistema utilizando HTML, CSS y JavaScript permitió integrar tanto la lógica de los algoritmos como la parte visual en una sola aplicación interactiva, lo que mejora significativamente la experiencia de aprendizaje.</w:t>
       </w:r>
     </w:p>
     <w:p>
@@ -4931,21 +5331,13 @@
         <w:rPr>
           <w:rFonts w:ascii="Times New Roman" w:hAnsi="Times New Roman" w:cs="Times New Roman"/>
         </w:rPr>
-        <w:t>Asimismo, el desarrollo de la interfaz gráfica permitió visualizar de manera clara y dinámica el comportamiento de ambos algoritmos mediante diagramas de Gantt y tablas de resultados, facilitando la comparación entre ellos y mejorando la comprensión del proceso de planificación.</w:t>
-      </w:r>
-    </w:p>
-    <w:p>
-      <w:pPr>
-        <w:jc w:val="both"/>
-        <w:rPr>
-          <w:rFonts w:ascii="Times New Roman" w:hAnsi="Times New Roman" w:cs="Times New Roman"/>
-        </w:rPr>
-      </w:pPr>
-      <w:r>
-        <w:rPr>
-          <w:rFonts w:ascii="Times New Roman" w:hAnsi="Times New Roman" w:cs="Times New Roman"/>
-        </w:rPr>
-        <w:t>Finalmente, se concluye que la combinación de visualización gráfica, carga de datos desde archivos CSV y simulación de algoritmos de planificación contribuye significativamente al entendimiento de los conceptos de sistemas operativos, permitiendo una experiencia más didáctica y práctica del tema.</w:t>
+        <w:t>En fin</w:t>
+      </w:r>
+      <w:r>
+        <w:rPr>
+          <w:rFonts w:ascii="Times New Roman" w:hAnsi="Times New Roman" w:cs="Times New Roman"/>
+        </w:rPr>
+        <w:t>, se puede concluir que este trabajo no solo cumple con el objetivo de simular los algoritmos, sino que también sirve como una herramienta educativa que ayuda a entender la importancia de la correcta gestión de CPU y memoria en los sistemas informáticos modernos.</w:t>
       </w:r>
     </w:p>
     <w:p>
@@ -4953,8 +5345,12 @@
         <w:pStyle w:val="Ttulo2"/>
       </w:pPr>
       <w:r>
-        <w:lastRenderedPageBreak/>
         <w:t>11. Anexos</w:t>
+      </w:r>
+    </w:p>
+    <w:p>
+      <w:r>
+        <w:t>Código fuente en GitHub</w:t>
       </w:r>
     </w:p>
     <w:p>
@@ -4963,20 +5359,22 @@
           <w:rPr>
             <w:rStyle w:val="Hipervnculo"/>
           </w:rPr>
-          <w:t>https://github.com/alainbru/Simulador-de-Procesos.git</w:t>
+          <w:t>https://github.com/alainbru/Simulador-de-Procesos-y-Gestion-de-memoria.git</w:t>
         </w:r>
       </w:hyperlink>
     </w:p>
     <w:p>
       <w:r>
-        <w:rPr>
-          <w:noProof/>
-        </w:rPr>
+        <w:t>Código fuente y la entrada de datos.</w:t>
+      </w:r>
+    </w:p>
+    <w:p>
+      <w:r>
         <w:drawing>
-          <wp:inline distT="0" distB="0" distL="0" distR="0" wp14:anchorId="6C9AD3CF" wp14:editId="491F3EE9">
-            <wp:extent cx="5760085" cy="3238500"/>
+          <wp:inline distT="0" distB="0" distL="0" distR="0" wp14:anchorId="0BF84E8A" wp14:editId="49648FDC">
+            <wp:extent cx="5760085" cy="3035935"/>
             <wp:effectExtent l="0" t="0" r="0" b="0"/>
-            <wp:docPr id="162745506" name="Imagen 1"/>
+            <wp:docPr id="1472999200" name="Imagen 1"/>
             <wp:cNvGraphicFramePr>
               <a:graphicFrameLocks xmlns:a="http://schemas.openxmlformats.org/drawingml/2006/main" noChangeAspect="1"/>
             </wp:cNvGraphicFramePr>
@@ -4984,7 +5382,7 @@
               <a:graphicData uri="http://schemas.openxmlformats.org/drawingml/2006/picture">
                 <pic:pic xmlns:pic="http://schemas.openxmlformats.org/drawingml/2006/picture">
                   <pic:nvPicPr>
-                    <pic:cNvPr id="162745506" name=""/>
+                    <pic:cNvPr id="1472999200" name=""/>
                     <pic:cNvPicPr/>
                   </pic:nvPicPr>
                   <pic:blipFill>
@@ -4996,7 +5394,7 @@
                   <pic:spPr>
                     <a:xfrm>
                       <a:off x="0" y="0"/>
-                      <a:ext cx="5760085" cy="3238500"/>
+                      <a:ext cx="5760085" cy="3035935"/>
                     </a:xfrm>
                     <a:prstGeom prst="rect">
                       <a:avLst/>
@@ -5011,14 +5409,17 @@
     </w:p>
     <w:p>
       <w:r>
-        <w:rPr>
-          <w:noProof/>
-        </w:rPr>
+        <w:t>Ventana de planificación de procesos.</w:t>
+      </w:r>
+    </w:p>
+    <w:p>
+      <w:r>
+        <w:lastRenderedPageBreak/>
         <w:drawing>
-          <wp:inline distT="0" distB="0" distL="0" distR="0" wp14:anchorId="3D5BB958" wp14:editId="7709F76F">
-            <wp:extent cx="5760085" cy="3238500"/>
-            <wp:effectExtent l="0" t="0" r="0" b="0"/>
-            <wp:docPr id="1501212514" name="Imagen 1"/>
+          <wp:inline distT="0" distB="0" distL="0" distR="0" wp14:anchorId="63EF10BE" wp14:editId="7D12956E">
+            <wp:extent cx="5760085" cy="2544445"/>
+            <wp:effectExtent l="0" t="0" r="0" b="8255"/>
+            <wp:docPr id="1295967576" name="Imagen 1"/>
             <wp:cNvGraphicFramePr>
               <a:graphicFrameLocks xmlns:a="http://schemas.openxmlformats.org/drawingml/2006/main" noChangeAspect="1"/>
             </wp:cNvGraphicFramePr>
@@ -5026,7 +5427,7 @@
               <a:graphicData uri="http://schemas.openxmlformats.org/drawingml/2006/picture">
                 <pic:pic xmlns:pic="http://schemas.openxmlformats.org/drawingml/2006/picture">
                   <pic:nvPicPr>
-                    <pic:cNvPr id="1501212514" name=""/>
+                    <pic:cNvPr id="1295967576" name=""/>
                     <pic:cNvPicPr/>
                   </pic:nvPicPr>
                   <pic:blipFill>
@@ -5038,7 +5439,7 @@
                   <pic:spPr>
                     <a:xfrm>
                       <a:off x="0" y="0"/>
-                      <a:ext cx="5760085" cy="3238500"/>
+                      <a:ext cx="5760085" cy="2544445"/>
                     </a:xfrm>
                     <a:prstGeom prst="rect">
                       <a:avLst/>
@@ -5051,10 +5452,53 @@
         </w:drawing>
       </w:r>
     </w:p>
-    <w:p/>
+    <w:p>
+      <w:r>
+        <w:t>Ventana de gestión de Memoria.</w:t>
+      </w:r>
+    </w:p>
+    <w:p>
+      <w:r>
+        <w:drawing>
+          <wp:inline distT="0" distB="0" distL="0" distR="0" wp14:anchorId="24B599EA" wp14:editId="5171D0BE">
+            <wp:extent cx="5760085" cy="2526665"/>
+            <wp:effectExtent l="0" t="0" r="0" b="6985"/>
+            <wp:docPr id="82898884" name="Imagen 1"/>
+            <wp:cNvGraphicFramePr>
+              <a:graphicFrameLocks xmlns:a="http://schemas.openxmlformats.org/drawingml/2006/main" noChangeAspect="1"/>
+            </wp:cNvGraphicFramePr>
+            <a:graphic xmlns:a="http://schemas.openxmlformats.org/drawingml/2006/main">
+              <a:graphicData uri="http://schemas.openxmlformats.org/drawingml/2006/picture">
+                <pic:pic xmlns:pic="http://schemas.openxmlformats.org/drawingml/2006/picture">
+                  <pic:nvPicPr>
+                    <pic:cNvPr id="82898884" name=""/>
+                    <pic:cNvPicPr/>
+                  </pic:nvPicPr>
+                  <pic:blipFill>
+                    <a:blip r:embed="rId16"/>
+                    <a:stretch>
+                      <a:fillRect/>
+                    </a:stretch>
+                  </pic:blipFill>
+                  <pic:spPr>
+                    <a:xfrm>
+                      <a:off x="0" y="0"/>
+                      <a:ext cx="5760085" cy="2526665"/>
+                    </a:xfrm>
+                    <a:prstGeom prst="rect">
+                      <a:avLst/>
+                    </a:prstGeom>
+                  </pic:spPr>
+                </pic:pic>
+              </a:graphicData>
+            </a:graphic>
+          </wp:inline>
+        </w:drawing>
+      </w:r>
+    </w:p>
     <w:sectPr>
-      <w:headerReference w:type="default" r:id="rId16"/>
-      <w:footerReference w:type="default" r:id="rId17"/>
+      <w:headerReference w:type="default" r:id="rId17"/>
+      <w:footerReference w:type="default" r:id="rId18"/>
       <w:type w:val="continuous"/>
       <w:pgSz w:w="11906" w:h="16838" w:code="9"/>
       <w:pgMar w:top="1134" w:right="1134" w:bottom="1134" w:left="1701" w:header="567" w:footer="284" w:gutter="0"/>
@@ -5475,6 +5919,119 @@
     </w:lvl>
   </w:abstractNum>
   <w:abstractNum w:abstractNumId="2" w15:restartNumberingAfterBreak="0">
+    <w:nsid w:val="344F0529"/>
+    <w:multiLevelType w:val="hybridMultilevel"/>
+    <w:tmpl w:val="6E4A7BAE"/>
+    <w:lvl w:ilvl="0" w:tplc="280A0001">
+      <w:start w:val="1"/>
+      <w:numFmt w:val="bullet"/>
+      <w:lvlText w:val=""/>
+      <w:lvlJc w:val="left"/>
+      <w:pPr>
+        <w:ind w:left="720" w:hanging="360"/>
+      </w:pPr>
+      <w:rPr>
+        <w:rFonts w:ascii="Symbol" w:hAnsi="Symbol" w:hint="default"/>
+      </w:rPr>
+    </w:lvl>
+    <w:lvl w:ilvl="1" w:tplc="280A0003" w:tentative="1">
+      <w:start w:val="1"/>
+      <w:numFmt w:val="bullet"/>
+      <w:lvlText w:val="o"/>
+      <w:lvlJc w:val="left"/>
+      <w:pPr>
+        <w:ind w:left="1440" w:hanging="360"/>
+      </w:pPr>
+      <w:rPr>
+        <w:rFonts w:ascii="Courier New" w:hAnsi="Courier New" w:cs="Courier New" w:hint="default"/>
+      </w:rPr>
+    </w:lvl>
+    <w:lvl w:ilvl="2" w:tplc="280A0005" w:tentative="1">
+      <w:start w:val="1"/>
+      <w:numFmt w:val="bullet"/>
+      <w:lvlText w:val=""/>
+      <w:lvlJc w:val="left"/>
+      <w:pPr>
+        <w:ind w:left="2160" w:hanging="360"/>
+      </w:pPr>
+      <w:rPr>
+        <w:rFonts w:ascii="Wingdings" w:hAnsi="Wingdings" w:hint="default"/>
+      </w:rPr>
+    </w:lvl>
+    <w:lvl w:ilvl="3" w:tplc="280A0001" w:tentative="1">
+      <w:start w:val="1"/>
+      <w:numFmt w:val="bullet"/>
+      <w:lvlText w:val=""/>
+      <w:lvlJc w:val="left"/>
+      <w:pPr>
+        <w:ind w:left="2880" w:hanging="360"/>
+      </w:pPr>
+      <w:rPr>
+        <w:rFonts w:ascii="Symbol" w:hAnsi="Symbol" w:hint="default"/>
+      </w:rPr>
+    </w:lvl>
+    <w:lvl w:ilvl="4" w:tplc="280A0003" w:tentative="1">
+      <w:start w:val="1"/>
+      <w:numFmt w:val="bullet"/>
+      <w:lvlText w:val="o"/>
+      <w:lvlJc w:val="left"/>
+      <w:pPr>
+        <w:ind w:left="3600" w:hanging="360"/>
+      </w:pPr>
+      <w:rPr>
+        <w:rFonts w:ascii="Courier New" w:hAnsi="Courier New" w:cs="Courier New" w:hint="default"/>
+      </w:rPr>
+    </w:lvl>
+    <w:lvl w:ilvl="5" w:tplc="280A0005" w:tentative="1">
+      <w:start w:val="1"/>
+      <w:numFmt w:val="bullet"/>
+      <w:lvlText w:val=""/>
+      <w:lvlJc w:val="left"/>
+      <w:pPr>
+        <w:ind w:left="4320" w:hanging="360"/>
+      </w:pPr>
+      <w:rPr>
+        <w:rFonts w:ascii="Wingdings" w:hAnsi="Wingdings" w:hint="default"/>
+      </w:rPr>
+    </w:lvl>
+    <w:lvl w:ilvl="6" w:tplc="280A0001" w:tentative="1">
+      <w:start w:val="1"/>
+      <w:numFmt w:val="bullet"/>
+      <w:lvlText w:val=""/>
+      <w:lvlJc w:val="left"/>
+      <w:pPr>
+        <w:ind w:left="5040" w:hanging="360"/>
+      </w:pPr>
+      <w:rPr>
+        <w:rFonts w:ascii="Symbol" w:hAnsi="Symbol" w:hint="default"/>
+      </w:rPr>
+    </w:lvl>
+    <w:lvl w:ilvl="7" w:tplc="280A0003" w:tentative="1">
+      <w:start w:val="1"/>
+      <w:numFmt w:val="bullet"/>
+      <w:lvlText w:val="o"/>
+      <w:lvlJc w:val="left"/>
+      <w:pPr>
+        <w:ind w:left="5760" w:hanging="360"/>
+      </w:pPr>
+      <w:rPr>
+        <w:rFonts w:ascii="Courier New" w:hAnsi="Courier New" w:cs="Courier New" w:hint="default"/>
+      </w:rPr>
+    </w:lvl>
+    <w:lvl w:ilvl="8" w:tplc="280A0005" w:tentative="1">
+      <w:start w:val="1"/>
+      <w:numFmt w:val="bullet"/>
+      <w:lvlText w:val=""/>
+      <w:lvlJc w:val="left"/>
+      <w:pPr>
+        <w:ind w:left="6480" w:hanging="360"/>
+      </w:pPr>
+      <w:rPr>
+        <w:rFonts w:ascii="Wingdings" w:hAnsi="Wingdings" w:hint="default"/>
+      </w:rPr>
+    </w:lvl>
+  </w:abstractNum>
+  <w:abstractNum w:abstractNumId="3" w15:restartNumberingAfterBreak="0">
     <w:nsid w:val="37073B9B"/>
     <w:multiLevelType w:val="hybridMultilevel"/>
     <w:tmpl w:val="D40C4938"/>
@@ -5587,10 +6144,10 @@
       </w:rPr>
     </w:lvl>
   </w:abstractNum>
-  <w:abstractNum w:abstractNumId="3" w15:restartNumberingAfterBreak="0">
-    <w:nsid w:val="395071A9"/>
+  <w:abstractNum w:abstractNumId="4" w15:restartNumberingAfterBreak="0">
+    <w:nsid w:val="422706D0"/>
     <w:multiLevelType w:val="hybridMultilevel"/>
-    <w:tmpl w:val="4A32D5AE"/>
+    <w:tmpl w:val="F878AD50"/>
     <w:lvl w:ilvl="0" w:tplc="280A0001">
       <w:start w:val="1"/>
       <w:numFmt w:val="bullet"/>
@@ -5700,7 +6257,7 @@
       </w:rPr>
     </w:lvl>
   </w:abstractNum>
-  <w:abstractNum w:abstractNumId="4" w15:restartNumberingAfterBreak="0">
+  <w:abstractNum w:abstractNumId="5" w15:restartNumberingAfterBreak="0">
     <w:nsid w:val="43332DFF"/>
     <w:multiLevelType w:val="hybridMultilevel"/>
     <w:tmpl w:val="95CAD1F0"/>
@@ -5813,7 +6370,7 @@
       </w:rPr>
     </w:lvl>
   </w:abstractNum>
-  <w:abstractNum w:abstractNumId="5" w15:restartNumberingAfterBreak="0">
+  <w:abstractNum w:abstractNumId="6" w15:restartNumberingAfterBreak="0">
     <w:nsid w:val="498D7225"/>
     <w:multiLevelType w:val="hybridMultilevel"/>
     <w:tmpl w:val="9640AA14"/>
@@ -5926,7 +6483,7 @@
       </w:rPr>
     </w:lvl>
   </w:abstractNum>
-  <w:abstractNum w:abstractNumId="6" w15:restartNumberingAfterBreak="0">
+  <w:abstractNum w:abstractNumId="7" w15:restartNumberingAfterBreak="0">
     <w:nsid w:val="4DCE23E8"/>
     <w:multiLevelType w:val="hybridMultilevel"/>
     <w:tmpl w:val="812880A0"/>
@@ -6039,7 +6596,93 @@
       </w:rPr>
     </w:lvl>
   </w:abstractNum>
-  <w:abstractNum w:abstractNumId="7" w15:restartNumberingAfterBreak="0">
+  <w:abstractNum w:abstractNumId="8" w15:restartNumberingAfterBreak="0">
+    <w:nsid w:val="584766F6"/>
+    <w:multiLevelType w:val="hybridMultilevel"/>
+    <w:tmpl w:val="66E4DA74"/>
+    <w:lvl w:ilvl="0" w:tplc="280A000F">
+      <w:start w:val="1"/>
+      <w:numFmt w:val="decimal"/>
+      <w:lvlText w:val="%1."/>
+      <w:lvlJc w:val="left"/>
+      <w:pPr>
+        <w:ind w:left="502" w:hanging="360"/>
+      </w:pPr>
+    </w:lvl>
+    <w:lvl w:ilvl="1" w:tplc="280A0019" w:tentative="1">
+      <w:start w:val="1"/>
+      <w:numFmt w:val="lowerLetter"/>
+      <w:lvlText w:val="%2."/>
+      <w:lvlJc w:val="left"/>
+      <w:pPr>
+        <w:ind w:left="1222" w:hanging="360"/>
+      </w:pPr>
+    </w:lvl>
+    <w:lvl w:ilvl="2" w:tplc="280A001B" w:tentative="1">
+      <w:start w:val="1"/>
+      <w:numFmt w:val="lowerRoman"/>
+      <w:lvlText w:val="%3."/>
+      <w:lvlJc w:val="right"/>
+      <w:pPr>
+        <w:ind w:left="1942" w:hanging="180"/>
+      </w:pPr>
+    </w:lvl>
+    <w:lvl w:ilvl="3" w:tplc="280A000F" w:tentative="1">
+      <w:start w:val="1"/>
+      <w:numFmt w:val="decimal"/>
+      <w:lvlText w:val="%4."/>
+      <w:lvlJc w:val="left"/>
+      <w:pPr>
+        <w:ind w:left="2662" w:hanging="360"/>
+      </w:pPr>
+    </w:lvl>
+    <w:lvl w:ilvl="4" w:tplc="280A0019" w:tentative="1">
+      <w:start w:val="1"/>
+      <w:numFmt w:val="lowerLetter"/>
+      <w:lvlText w:val="%5."/>
+      <w:lvlJc w:val="left"/>
+      <w:pPr>
+        <w:ind w:left="3382" w:hanging="360"/>
+      </w:pPr>
+    </w:lvl>
+    <w:lvl w:ilvl="5" w:tplc="280A001B" w:tentative="1">
+      <w:start w:val="1"/>
+      <w:numFmt w:val="lowerRoman"/>
+      <w:lvlText w:val="%6."/>
+      <w:lvlJc w:val="right"/>
+      <w:pPr>
+        <w:ind w:left="4102" w:hanging="180"/>
+      </w:pPr>
+    </w:lvl>
+    <w:lvl w:ilvl="6" w:tplc="280A000F" w:tentative="1">
+      <w:start w:val="1"/>
+      <w:numFmt w:val="decimal"/>
+      <w:lvlText w:val="%7."/>
+      <w:lvlJc w:val="left"/>
+      <w:pPr>
+        <w:ind w:left="4822" w:hanging="360"/>
+      </w:pPr>
+    </w:lvl>
+    <w:lvl w:ilvl="7" w:tplc="280A0019" w:tentative="1">
+      <w:start w:val="1"/>
+      <w:numFmt w:val="lowerLetter"/>
+      <w:lvlText w:val="%8."/>
+      <w:lvlJc w:val="left"/>
+      <w:pPr>
+        <w:ind w:left="5542" w:hanging="360"/>
+      </w:pPr>
+    </w:lvl>
+    <w:lvl w:ilvl="8" w:tplc="280A001B" w:tentative="1">
+      <w:start w:val="1"/>
+      <w:numFmt w:val="lowerRoman"/>
+      <w:lvlText w:val="%9."/>
+      <w:lvlJc w:val="right"/>
+      <w:pPr>
+        <w:ind w:left="6262" w:hanging="180"/>
+      </w:pPr>
+    </w:lvl>
+  </w:abstractNum>
+  <w:abstractNum w:abstractNumId="9" w15:restartNumberingAfterBreak="0">
     <w:nsid w:val="677B23A5"/>
     <w:multiLevelType w:val="hybridMultilevel"/>
     <w:tmpl w:val="70C0032C"/>
@@ -6152,17 +6795,17 @@
       </w:rPr>
     </w:lvl>
   </w:abstractNum>
-  <w:abstractNum w:abstractNumId="8" w15:restartNumberingAfterBreak="0">
-    <w:nsid w:val="7EF42D63"/>
+  <w:abstractNum w:abstractNumId="10" w15:restartNumberingAfterBreak="0">
+    <w:nsid w:val="6C234A46"/>
     <w:multiLevelType w:val="hybridMultilevel"/>
-    <w:tmpl w:val="CBA071CC"/>
+    <w:tmpl w:val="35345BFE"/>
     <w:lvl w:ilvl="0" w:tplc="280A0001">
       <w:start w:val="1"/>
       <w:numFmt w:val="bullet"/>
       <w:lvlText w:val=""/>
       <w:lvlJc w:val="left"/>
       <w:pPr>
-        <w:ind w:left="720" w:hanging="360"/>
+        <w:ind w:left="502" w:hanging="360"/>
       </w:pPr>
       <w:rPr>
         <w:rFonts w:ascii="Symbol" w:hAnsi="Symbol" w:hint="default"/>
@@ -6265,34 +6908,156 @@
       </w:rPr>
     </w:lvl>
   </w:abstractNum>
-  <w:num w:numId="1" w16cid:durableId="19163878">
+  <w:abstractNum w:abstractNumId="11" w15:restartNumberingAfterBreak="0">
+    <w:nsid w:val="7E7D54CD"/>
+    <w:multiLevelType w:val="hybridMultilevel"/>
+    <w:tmpl w:val="F03A766E"/>
+    <w:lvl w:ilvl="0" w:tplc="280A0001">
+      <w:start w:val="1"/>
+      <w:numFmt w:val="bullet"/>
+      <w:lvlText w:val=""/>
+      <w:lvlJc w:val="left"/>
+      <w:pPr>
+        <w:ind w:left="720" w:hanging="360"/>
+      </w:pPr>
+      <w:rPr>
+        <w:rFonts w:ascii="Symbol" w:hAnsi="Symbol" w:hint="default"/>
+      </w:rPr>
+    </w:lvl>
+    <w:lvl w:ilvl="1" w:tplc="280A0003" w:tentative="1">
+      <w:start w:val="1"/>
+      <w:numFmt w:val="bullet"/>
+      <w:lvlText w:val="o"/>
+      <w:lvlJc w:val="left"/>
+      <w:pPr>
+        <w:ind w:left="1440" w:hanging="360"/>
+      </w:pPr>
+      <w:rPr>
+        <w:rFonts w:ascii="Courier New" w:hAnsi="Courier New" w:cs="Courier New" w:hint="default"/>
+      </w:rPr>
+    </w:lvl>
+    <w:lvl w:ilvl="2" w:tplc="280A0005" w:tentative="1">
+      <w:start w:val="1"/>
+      <w:numFmt w:val="bullet"/>
+      <w:lvlText w:val=""/>
+      <w:lvlJc w:val="left"/>
+      <w:pPr>
+        <w:ind w:left="2160" w:hanging="360"/>
+      </w:pPr>
+      <w:rPr>
+        <w:rFonts w:ascii="Wingdings" w:hAnsi="Wingdings" w:hint="default"/>
+      </w:rPr>
+    </w:lvl>
+    <w:lvl w:ilvl="3" w:tplc="280A0001" w:tentative="1">
+      <w:start w:val="1"/>
+      <w:numFmt w:val="bullet"/>
+      <w:lvlText w:val=""/>
+      <w:lvlJc w:val="left"/>
+      <w:pPr>
+        <w:ind w:left="2880" w:hanging="360"/>
+      </w:pPr>
+      <w:rPr>
+        <w:rFonts w:ascii="Symbol" w:hAnsi="Symbol" w:hint="default"/>
+      </w:rPr>
+    </w:lvl>
+    <w:lvl w:ilvl="4" w:tplc="280A0003" w:tentative="1">
+      <w:start w:val="1"/>
+      <w:numFmt w:val="bullet"/>
+      <w:lvlText w:val="o"/>
+      <w:lvlJc w:val="left"/>
+      <w:pPr>
+        <w:ind w:left="3600" w:hanging="360"/>
+      </w:pPr>
+      <w:rPr>
+        <w:rFonts w:ascii="Courier New" w:hAnsi="Courier New" w:cs="Courier New" w:hint="default"/>
+      </w:rPr>
+    </w:lvl>
+    <w:lvl w:ilvl="5" w:tplc="280A0005" w:tentative="1">
+      <w:start w:val="1"/>
+      <w:numFmt w:val="bullet"/>
+      <w:lvlText w:val=""/>
+      <w:lvlJc w:val="left"/>
+      <w:pPr>
+        <w:ind w:left="4320" w:hanging="360"/>
+      </w:pPr>
+      <w:rPr>
+        <w:rFonts w:ascii="Wingdings" w:hAnsi="Wingdings" w:hint="default"/>
+      </w:rPr>
+    </w:lvl>
+    <w:lvl w:ilvl="6" w:tplc="280A0001" w:tentative="1">
+      <w:start w:val="1"/>
+      <w:numFmt w:val="bullet"/>
+      <w:lvlText w:val=""/>
+      <w:lvlJc w:val="left"/>
+      <w:pPr>
+        <w:ind w:left="5040" w:hanging="360"/>
+      </w:pPr>
+      <w:rPr>
+        <w:rFonts w:ascii="Symbol" w:hAnsi="Symbol" w:hint="default"/>
+      </w:rPr>
+    </w:lvl>
+    <w:lvl w:ilvl="7" w:tplc="280A0003" w:tentative="1">
+      <w:start w:val="1"/>
+      <w:numFmt w:val="bullet"/>
+      <w:lvlText w:val="o"/>
+      <w:lvlJc w:val="left"/>
+      <w:pPr>
+        <w:ind w:left="5760" w:hanging="360"/>
+      </w:pPr>
+      <w:rPr>
+        <w:rFonts w:ascii="Courier New" w:hAnsi="Courier New" w:cs="Courier New" w:hint="default"/>
+      </w:rPr>
+    </w:lvl>
+    <w:lvl w:ilvl="8" w:tplc="280A0005" w:tentative="1">
+      <w:start w:val="1"/>
+      <w:numFmt w:val="bullet"/>
+      <w:lvlText w:val=""/>
+      <w:lvlJc w:val="left"/>
+      <w:pPr>
+        <w:ind w:left="6480" w:hanging="360"/>
+      </w:pPr>
+      <w:rPr>
+        <w:rFonts w:ascii="Wingdings" w:hAnsi="Wingdings" w:hint="default"/>
+      </w:rPr>
+    </w:lvl>
+  </w:abstractNum>
+  <w:num w:numId="1" w16cid:durableId="1563523224">
     <w:abstractNumId w:val="3"/>
   </w:num>
-  <w:num w:numId="2" w16cid:durableId="1184393926">
+  <w:num w:numId="2" w16cid:durableId="1087843164">
+    <w:abstractNumId w:val="1"/>
+  </w:num>
+  <w:num w:numId="3" w16cid:durableId="836190402">
+    <w:abstractNumId w:val="0"/>
+  </w:num>
+  <w:num w:numId="4" w16cid:durableId="128938357">
+    <w:abstractNumId w:val="9"/>
+  </w:num>
+  <w:num w:numId="5" w16cid:durableId="1201623557">
+    <w:abstractNumId w:val="7"/>
+  </w:num>
+  <w:num w:numId="6" w16cid:durableId="779956448">
+    <w:abstractNumId w:val="6"/>
+  </w:num>
+  <w:num w:numId="7" w16cid:durableId="1915504175">
+    <w:abstractNumId w:val="5"/>
+  </w:num>
+  <w:num w:numId="8" w16cid:durableId="1001393671">
     <w:abstractNumId w:val="8"/>
   </w:num>
-  <w:num w:numId="3" w16cid:durableId="1563523224">
+  <w:num w:numId="9" w16cid:durableId="1398748204">
     <w:abstractNumId w:val="2"/>
   </w:num>
-  <w:num w:numId="4" w16cid:durableId="1087843164">
-    <w:abstractNumId w:val="1"/>
+  <w:num w:numId="10" w16cid:durableId="872498967">
+    <w:abstractNumId w:val="11"/>
   </w:num>
-  <w:num w:numId="5" w16cid:durableId="836190402">
-    <w:abstractNumId w:val="0"/>
+  <w:num w:numId="11" w16cid:durableId="1968730785">
+    <w:abstractNumId w:val="10"/>
   </w:num>
-  <w:num w:numId="6" w16cid:durableId="128938357">
-    <w:abstractNumId w:val="7"/>
-  </w:num>
-  <w:num w:numId="7" w16cid:durableId="1201623557">
-    <w:abstractNumId w:val="6"/>
-  </w:num>
-  <w:num w:numId="8" w16cid:durableId="779956448">
-    <w:abstractNumId w:val="5"/>
-  </w:num>
-  <w:num w:numId="9" w16cid:durableId="1915504175">
+  <w:num w:numId="12" w16cid:durableId="1590113037">
     <w:abstractNumId w:val="4"/>
   </w:num>
-  <w:numIdMacAtCleanup w:val="9"/>
+  <w:numIdMacAtCleanup w:val="12"/>
 </w:numbering>
 </file>
 

</xml_diff>